<commit_message>
Sync documentation with v1.4.5/v1.4.6 changes; regenerate stale docx
USER_DOCUMENTATION.md: document address field in top_locations attribute,
clarify Configureren vs. Herconfigureren now behave identically (v1.4.6 fix).
SETUP_DOCUMENTATION.md: add a manual test step for the reconfigure fix.

User_Documentation.docx had been frozen at v1.0.0 since the initial commit,
missing ~18 versions of features (routing, map markers, operator filter,
driving distance, etc). Regenerated it from USER_DOCUMENTATION.md in the
existing house style (section banners, tables, code blocks).
</commit_message>
<xml_diff>
--- a/User_Documentation.docx
+++ b/User_Documentation.docx
@@ -4,11 +4,10 @@
   <w:body>
     <w:p>
       <w:pPr>
-        <w:jc w:val="center"/>
+        <w:jc w:val="left"/>
       </w:pPr>
       <w:r>
         <w:rPr>
-          <w:rFonts w:ascii="Calibri" w:hAnsi="Calibri"/>
           <w:b/>
           <w:color w:val="013449"/>
           <w:sz w:val="68"/>
@@ -17,9 +16,6 @@
       </w:r>
     </w:p>
     <w:p>
-      <w:pPr>
-        <w:jc w:val="center"/>
-      </w:pPr>
       <w:r>
         <w:rPr>
           <w:b/>
@@ -27,6 +23,58 @@
           <w:sz w:val="36"/>
         </w:rPr>
         <w:t>Gebruikersdocumentatie</w:t>
+      </w:r>
+    </w:p>
+    <w:p/>
+    <w:p>
+      <w:r>
+        <w:t>Versie 1.4.6 — 2026-07-13</w:t>
+      </w:r>
+    </w:p>
+    <w:p>
+      <w:r>
+        <w:t>Developed by Vincent van Unen — www.unen.nl — code@unen.nl</w:t>
+      </w:r>
+    </w:p>
+    <w:p/>
+    <w:p/>
+    <w:tbl>
+      <w:tblPr>
+        <w:tblW w:type="auto" w:w="0"/>
+        <w:tblLayout w:type="autofit"/>
+        <w:tblLook w:firstColumn="1" w:firstRow="1" w:lastColumn="0" w:lastRow="0" w:noHBand="0" w:noVBand="1" w:val="04A0"/>
+      </w:tblPr>
+      <w:tblGrid>
+        <w:gridCol w:w="8640"/>
+      </w:tblGrid>
+      <w:tr>
+        <w:tc>
+          <w:tcPr>
+            <w:tcW w:type="dxa" w:w="8640"/>
+            <w:shd w:val="clear" w:color="auto" w:fill="013449"/>
+          </w:tcPr>
+          <w:p>
+            <w:r>
+              <w:rPr>
+                <w:b/>
+                <w:color w:val="FFFFFF"/>
+                <w:sz w:val="30"/>
+              </w:rPr>
+              <w:t>1. Functionaliteit</w:t>
+            </w:r>
+          </w:p>
+        </w:tc>
+      </w:tr>
+    </w:tbl>
+    <w:p/>
+    <w:p>
+      <w:r>
+        <w:t>VUN EV Charge Monitor zoekt openbare laadpunten rond een Home Assistant-zone, toont de actuele beschikbaarheid via entiteiten, en stuurt (optioneel) een melding zodra een gevolgde persoon of device tracker die zone binnenkomt.</w:t>
+      </w:r>
+    </w:p>
+    <w:p>
+      <w:r>
+        <w:t>De integratie draait volledig lokaal binnen Home Assistant — geen aparte service, container of cloudbackend nodig.</w:t>
       </w:r>
     </w:p>
     <w:tbl>
@@ -39,51 +87,99 @@
         <w:gridCol w:w="8640"/>
       </w:tblGrid>
       <w:tr>
-        <w:trPr>
-          <w:trHeight w:val="85"/>
-        </w:trPr>
         <w:tc>
           <w:tcPr>
             <w:tcW w:type="dxa" w:w="8640"/>
-            <w:shd w:val="clear" w:color="auto" w:fill="38D9E9"/>
+            <w:shd w:val="clear" w:color="auto" w:fill="013449"/>
           </w:tcPr>
-          <w:p/>
+          <w:p>
+            <w:r>
+              <w:rPr>
+                <w:b/>
+                <w:color w:val="FFFFFF"/>
+                <w:sz w:val="30"/>
+              </w:rPr>
+              <w:t>2. Dagelijks gebruik</w:t>
+            </w:r>
+          </w:p>
         </w:tc>
       </w:tr>
     </w:tbl>
     <w:p/>
     <w:p>
-      <w:pPr>
-        <w:jc w:val="center"/>
-      </w:pPr>
       <w:r>
-        <w:rPr>
-          <w:color w:val="555555"/>
-          <w:sz w:val="24"/>
-        </w:rPr>
-        <w:t>Versie 1.0.0 — 2026-07-10</w:t>
+        <w:t>Na installatie en configuratie werkt de integratie op de achtergrond:</w:t>
       </w:r>
     </w:p>
     <w:p>
       <w:pPr>
-        <w:jc w:val="center"/>
+        <w:pStyle w:val="ListNumber"/>
       </w:pPr>
       <w:r>
-        <w:rPr>
-          <w:color w:val="777777"/>
-          <w:sz w:val="20"/>
-        </w:rPr>
-        <w:t>Developed by Vincent van Unen — www.unen.nl — code@unen.nl</w:t>
+        <w:t>De coordinator haalt periodiek (standaard elke 5 minuten) actuele</w:t>
       </w:r>
     </w:p>
     <w:p>
       <w:r>
-        <w:br w:type="page"/>
+        <w:t>laadpuntdata op binnen de ingestelde radius rond je zone.</w:t>
+      </w:r>
+    </w:p>
+    <w:p>
+      <w:pPr>
+        <w:pStyle w:val="ListNumber"/>
+      </w:pPr>
+      <w:r>
+        <w:t>De sensoren tonen altijd de meest recente, gefilterde en gesorteerde data.</w:t>
+      </w:r>
+    </w:p>
+    <w:p>
+      <w:pPr>
+        <w:pStyle w:val="ListNumber"/>
+      </w:pPr>
+      <w:r>
+        <w:t>Komt een gevolgde persoon/tracker de zone binnen, dan ontvang je (indien</w:t>
+      </w:r>
+    </w:p>
+    <w:p>
+      <w:r>
+        <w:t>ingeschakeld) automatisch een melding met de beste laadopties.</w:t>
+      </w:r>
+    </w:p>
+    <w:p>
+      <w:pPr>
+        <w:pStyle w:val="ListNumber"/>
+      </w:pPr>
+      <w:r>
+        <w:t xml:space="preserve">Je kunt op elk moment handmatig vernieuwen via de </w:t>
+      </w:r>
+      <w:r>
+        <w:rPr>
+          <w:b/>
+        </w:rPr>
+        <w:t>Vernieuwen</w:t>
+      </w:r>
+      <w:r>
+        <w:t>-knop, of</w:t>
+      </w:r>
+    </w:p>
+    <w:p>
+      <w:r>
+        <w:t xml:space="preserve">een testmelding versturen via </w:t>
+      </w:r>
+      <w:r>
+        <w:rPr>
+          <w:b/>
+        </w:rPr>
+        <w:t>Testmelding versturen</w:t>
+      </w:r>
+      <w:r>
+        <w:t>.</w:t>
       </w:r>
     </w:p>
     <w:tbl>
       <w:tblPr>
         <w:tblW w:type="auto" w:w="0"/>
+        <w:tblLayout w:type="autofit"/>
         <w:tblLook w:firstColumn="1" w:firstRow="1" w:lastColumn="0" w:lastRow="0" w:noHBand="0" w:noVBand="1" w:val="04A0"/>
       </w:tblPr>
       <w:tblGrid>
@@ -96,14 +192,13 @@
             <w:shd w:val="clear" w:color="auto" w:fill="013449"/>
           </w:tcPr>
           <w:p>
-            <w:r/>
             <w:r>
               <w:rPr>
                 <w:b/>
                 <w:color w:val="FFFFFF"/>
-                <w:sz w:val="36"/>
+                <w:sz w:val="30"/>
               </w:rPr>
-              <w:t>1. Functionaliteit</w:t>
+              <w:t>3. Configuratie</w:t>
             </w:r>
           </w:p>
         </w:tc>
@@ -111,20 +206,393 @@
     </w:tbl>
     <w:p/>
     <w:p>
+      <w:r>
+        <w:t xml:space="preserve">Voeg de integratie toe via </w:t>
+      </w:r>
+      <w:r>
+        <w:rPr>
+          <w:b/>
+        </w:rPr>
+        <w:t>Instellingen → Apparaten &amp; diensten → Integratie toevoegen → VUN EV Charge Monitor</w:t>
+      </w:r>
+      <w:r>
+        <w:t>. De configuratie doorloopt vier stappen:</w:t>
+      </w:r>
+    </w:p>
+    <w:p>
+      <w:r>
+        <w:rPr>
+          <w:b/>
+          <w:color w:val="013449"/>
+          <w:sz w:val="24"/>
+        </w:rPr>
+        <w:t>1. Zone en provider</w:t>
+      </w:r>
+    </w:p>
+    <w:p>
       <w:pPr>
-        <w:spacing w:after="160"/>
+        <w:pStyle w:val="ListBullet"/>
       </w:pPr>
       <w:r>
         <w:rPr>
-          <w:color w:val="1A1A1A"/>
-          <w:sz w:val="22"/>
+          <w:b/>
         </w:rPr>
-        <w:t>VUN EV Charge Monitor zoekt openbare laadpunten rond een Home Assistant-zone, toont de actuele beschikbaarheid via entiteiten, en stuurt automatisch een melding zodra een gevolgde persoon of device tracker die zone binnenkomt. De integratie draait volledig lokaal binnen Home Assistant.</w:t>
+        <w:t>Zone</w:t>
+      </w:r>
+      <w:r>
+        <w:t>: een bestaande Home Assistant-zone als zoekmiddelpunt.</w:t>
+      </w:r>
+    </w:p>
+    <w:p>
+      <w:pPr>
+        <w:pStyle w:val="ListBullet"/>
+      </w:pPr>
+      <w:r>
+        <w:rPr>
+          <w:b/>
+        </w:rPr>
+        <w:t>Provider</w:t>
+      </w:r>
+      <w:r>
+        <w:t>: de databron.</w:t>
+      </w:r>
+    </w:p>
+    <w:p>
+      <w:pPr>
+        <w:pStyle w:val="ListBullet"/>
+      </w:pPr>
+      <w:r>
+        <w:rPr>
+          <w:b/>
+        </w:rPr>
+        <w:t>NDW DOT-NL</w:t>
+      </w:r>
+      <w:r>
+        <w:t xml:space="preserve"> — officiële Nederlandse open dataset, werkt zonder key.</w:t>
+      </w:r>
+    </w:p>
+    <w:p>
+      <w:pPr>
+        <w:pStyle w:val="ListBullet"/>
+      </w:pPr>
+      <w:r>
+        <w:rPr>
+          <w:b/>
+        </w:rPr>
+        <w:t>TomTom</w:t>
+      </w:r>
+      <w:r>
+        <w:t xml:space="preserve"> — vereist je eigen TomTom-API-key, levert per-aansluiting-status.</w:t>
+      </w:r>
+    </w:p>
+    <w:p>
+      <w:pPr>
+        <w:pStyle w:val="ListBullet"/>
+      </w:pPr>
+      <w:r>
+        <w:rPr>
+          <w:b/>
+        </w:rPr>
+        <w:t>Open Charge Map</w:t>
+      </w:r>
+      <w:r>
+        <w:t xml:space="preserve"> — vereist een gratis API-key, uitsluitend statische</w:t>
+      </w:r>
+    </w:p>
+    <w:p>
+      <w:r>
+        <w:t>locatiedata (geen actuele bezetting).</w:t>
+      </w:r>
+    </w:p>
+    <w:p>
+      <w:pPr>
+        <w:pStyle w:val="ListBullet"/>
+      </w:pPr>
+      <w:r>
+        <w:rPr>
+          <w:b/>
+        </w:rPr>
+        <w:t>API-key</w:t>
+      </w:r>
+      <w:r>
+        <w:t>: optioneel/verplicht afhankelijk van de gekozen provider.</w:t>
+      </w:r>
+    </w:p>
+    <w:p>
+      <w:pPr>
+        <w:pStyle w:val="ListBullet"/>
+      </w:pPr>
+      <w:r>
+        <w:rPr>
+          <w:b/>
+        </w:rPr>
+        <w:t>Simulatiemodus</w:t>
+      </w:r>
+      <w:r>
+        <w:t>: gebruikt lokale testdata, geen echte API-calls (zie</w:t>
+      </w:r>
+    </w:p>
+    <w:p>
+      <w:r>
+        <w:t>onder).</w:t>
+      </w:r>
+    </w:p>
+    <w:p>
+      <w:r>
+        <w:rPr>
+          <w:b/>
+          <w:color w:val="013449"/>
+          <w:sz w:val="24"/>
+        </w:rPr>
+        <w:t>2. Gevolgde personen en apparaten</w:t>
+      </w:r>
+    </w:p>
+    <w:p>
+      <w:r>
+        <w:t xml:space="preserve">Selecteer minimaal één </w:t>
+      </w:r>
+      <w:r>
+        <w:rPr>
+          <w:rFonts w:ascii="Consolas" w:hAnsi="Consolas"/>
+          <w:sz w:val="20"/>
+        </w:rPr>
+        <w:t>person</w:t>
+      </w:r>
+      <w:r>
+        <w:t xml:space="preserve">- en/of </w:t>
+      </w:r>
+      <w:r>
+        <w:rPr>
+          <w:rFonts w:ascii="Consolas" w:hAnsi="Consolas"/>
+          <w:sz w:val="20"/>
+        </w:rPr>
+        <w:t>device_tracker</w:t>
+      </w:r>
+      <w:r>
+        <w:t>-entiteit. Zodra een van deze de gekozen zone binnenkomt, wordt (indien ingeschakeld) een melding verstuurd.</w:t>
+      </w:r>
+    </w:p>
+    <w:p>
+      <w:r>
+        <w:rPr>
+          <w:b/>
+          <w:color w:val="013449"/>
+          <w:sz w:val="24"/>
+        </w:rPr>
+        <w:t>3. Zoekopties</w:t>
+      </w:r>
+    </w:p>
+    <w:p>
+      <w:pPr>
+        <w:pStyle w:val="ListBullet"/>
+      </w:pPr>
+      <w:r>
+        <w:t>Zoekradius (of de radius van de zone zelf gebruiken).</w:t>
+      </w:r>
+    </w:p>
+    <w:p>
+      <w:pPr>
+        <w:pStyle w:val="ListBullet"/>
+      </w:pPr>
+      <w:r>
+        <w:t>Maximaal aantal resultaten.</w:t>
+      </w:r>
+    </w:p>
+    <w:p>
+      <w:pPr>
+        <w:pStyle w:val="ListBullet"/>
+      </w:pPr>
+      <w:r>
+        <w:t>Connectortypen (leeg = alle).</w:t>
+      </w:r>
+    </w:p>
+    <w:p>
+      <w:pPr>
+        <w:pStyle w:val="ListBullet"/>
+      </w:pPr>
+      <w:r>
+        <w:t>Minimaal laadvermogen.</w:t>
+      </w:r>
+    </w:p>
+    <w:p>
+      <w:pPr>
+        <w:pStyle w:val="ListBullet"/>
+      </w:pPr>
+      <w:r>
+        <w:t>Update-interval.</w:t>
+      </w:r>
+    </w:p>
+    <w:p>
+      <w:pPr>
+        <w:pStyle w:val="ListBullet"/>
+      </w:pPr>
+      <w:r>
+        <w:t>Maximumleeftijd van data (waarna deze als "verouderd" wordt gemarkeerd).</w:t>
+      </w:r>
+    </w:p>
+    <w:p>
+      <w:pPr>
+        <w:pStyle w:val="ListBullet"/>
+      </w:pPr>
+      <w:r>
+        <w:t>Operators uitsluiten (typ een naam en druk op enter — bv. om een netwerk</w:t>
+      </w:r>
+    </w:p>
+    <w:p>
+      <w:r>
+        <w:t>waar je geen pas voor hebt te negeren; laat leeg om alle operators mee te nemen, dit heeft standaard geen voorkeur voor enig merk).</w:t>
+      </w:r>
+    </w:p>
+    <w:p>
+      <w:pPr>
+        <w:pStyle w:val="ListBullet"/>
+      </w:pPr>
+      <w:r>
+        <w:t>Echte rijafstand gebruiken i.p.v. hemelsbreed (vereist een gratis</w:t>
+      </w:r>
+    </w:p>
+    <w:p>
+      <w:r>
+        <w:rPr>
+          <w:i/>
+        </w:rPr>
+        <w:t>OpenRouteService (https://openrouteservice.org/dev/#/signup)</w:t>
+      </w:r>
+      <w:r>
+        <w:t>-API-key). Dit wordt alleen toegepast op de eerste paar (top-5) kandidaten na sortering op hemelsbrede afstand — niet op de volledige resultatenlijst, om het aantal externe aanvragen laag te houden.</w:t>
+      </w:r>
+    </w:p>
+    <w:p>
+      <w:pPr>
+        <w:pStyle w:val="ListBullet"/>
+      </w:pPr>
+      <w:r>
+        <w:t>Bestemmingszone voor routegebaseerd zoeken (optioneel — zie</w:t>
+      </w:r>
+    </w:p>
+    <w:p>
+      <w:r>
+        <w:t>"Routegebaseerd zoeken" hieronder). Vereist dezelfde OpenRouteService-key.</w:t>
+      </w:r>
+    </w:p>
+    <w:p>
+      <w:pPr>
+        <w:pStyle w:val="ListBullet"/>
+      </w:pPr>
+      <w:r>
+        <w:t>Breedte van de routecorridor (hoe ver een laadpunt van de route mag liggen,</w:t>
+      </w:r>
+    </w:p>
+    <w:p>
+      <w:r>
+        <w:t>standaard 1000 meter, instelbaar tussen 100 en 5000 meter).</w:t>
+      </w:r>
+    </w:p>
+    <w:p>
+      <w:r>
+        <w:rPr>
+          <w:b/>
+          <w:color w:val="013449"/>
+          <w:sz w:val="24"/>
+        </w:rPr>
+        <w:t>4. Notificaties</w:t>
+      </w:r>
+    </w:p>
+    <w:p>
+      <w:pPr>
+        <w:pStyle w:val="ListBullet"/>
+      </w:pPr>
+      <w:r>
+        <w:t xml:space="preserve">Notificatiedoel (een </w:t>
+      </w:r>
+      <w:r>
+        <w:rPr>
+          <w:rFonts w:ascii="Consolas" w:hAnsi="Consolas"/>
+          <w:sz w:val="20"/>
+        </w:rPr>
+        <w:t>notify</w:t>
+      </w:r>
+      <w:r>
+        <w:t>-entiteit, apparaat, gebied of label).</w:t>
+      </w:r>
+    </w:p>
+    <w:p>
+      <w:pPr>
+        <w:pStyle w:val="ListBullet"/>
+      </w:pPr>
+      <w:r>
+        <w:t>Melding bij zone-entry aan/uit.</w:t>
+      </w:r>
+    </w:p>
+    <w:p>
+      <w:pPr>
+        <w:pStyle w:val="ListBullet"/>
+      </w:pPr>
+      <w:r>
+        <w:t>Melding bij wijziging beschikbaarheid aan/uit.</w:t>
+      </w:r>
+    </w:p>
+    <w:p>
+      <w:pPr>
+        <w:pStyle w:val="ListBullet"/>
+      </w:pPr>
+      <w:r>
+        <w:t>Cooldown tussen meldingen (minuten).</w:t>
+      </w:r>
+    </w:p>
+    <w:p>
+      <w:pPr>
+        <w:pStyle w:val="ListBullet"/>
+      </w:pPr>
+      <w:r>
+        <w:t>Taal van de melding (Nederlands/Engels).</w:t>
+      </w:r>
+    </w:p>
+    <w:p>
+      <w:r>
+        <w:t xml:space="preserve">Alle instellingen zijn achteraf aanpasbaar via </w:t>
+      </w:r>
+      <w:r>
+        <w:rPr>
+          <w:b/>
+        </w:rPr>
+        <w:t>Configureren</w:t>
+      </w:r>
+      <w:r>
+        <w:t xml:space="preserve"> op de integratietegel (doorloopt dezelfde vier stappen). Dit is te onderscheiden van </w:t>
+      </w:r>
+      <w:r>
+        <w:rPr>
+          <w:b/>
+        </w:rPr>
+        <w:t>Herconfigureren</w:t>
+      </w:r>
+      <w:r>
+        <w:t xml:space="preserve"> (drie-puntjes-menu op de integratietegel): dat is bedoeld om zone/provider/API-key te wijzigen, maar doorloopt sinds v1.4.6 ook alle overige stappen en past dezelfde instellingen aan als </w:t>
+      </w:r>
+      <w:r>
+        <w:rPr>
+          <w:b/>
+        </w:rPr>
+        <w:t>Configureren</w:t>
+      </w:r>
+      <w:r>
+        <w:t xml:space="preserve"> — beide routes zijn nu gelijkwaardig. Vóór v1.4.6 werden wijzigingen via Herconfigureren soms genegeerd zodra </w:t>
+      </w:r>
+      <w:r>
+        <w:rPr>
+          <w:b/>
+        </w:rPr>
+        <w:t>Configureren</w:t>
+      </w:r>
+      <w:r>
+        <w:t xml:space="preserve"> al eens gebruikt was.</w:t>
       </w:r>
     </w:p>
     <w:tbl>
       <w:tblPr>
         <w:tblW w:type="auto" w:w="0"/>
+        <w:tblLayout w:type="autofit"/>
         <w:tblLook w:firstColumn="1" w:firstRow="1" w:lastColumn="0" w:lastRow="0" w:noHBand="0" w:noVBand="1" w:val="04A0"/>
       </w:tblPr>
       <w:tblGrid>
@@ -137,338 +605,11 @@
             <w:shd w:val="clear" w:color="auto" w:fill="013449"/>
           </w:tcPr>
           <w:p>
-            <w:r/>
             <w:r>
               <w:rPr>
                 <w:b/>
                 <w:color w:val="FFFFFF"/>
-                <w:sz w:val="36"/>
-              </w:rPr>
-              <w:t>2. Dagelijks gebruik</w:t>
-            </w:r>
-          </w:p>
-        </w:tc>
-      </w:tr>
-    </w:tbl>
-    <w:p/>
-    <w:p>
-      <w:pPr>
-        <w:pStyle w:val="ListBullet"/>
-      </w:pPr>
-      <w:r>
-        <w:rPr>
-          <w:color w:val="1A1A1A"/>
-          <w:sz w:val="22"/>
-        </w:rPr>
-        <w:t>De coordinator haalt periodiek actuele laadpuntdata op binnen de ingestelde radius.</w:t>
-      </w:r>
-    </w:p>
-    <w:p>
-      <w:pPr>
-        <w:pStyle w:val="ListBullet"/>
-      </w:pPr>
-      <w:r>
-        <w:rPr>
-          <w:color w:val="1A1A1A"/>
-          <w:sz w:val="22"/>
-        </w:rPr>
-        <w:t>Sensoren tonen altijd de meest recente, gefilterde en gesorteerde data.</w:t>
-      </w:r>
-    </w:p>
-    <w:p>
-      <w:pPr>
-        <w:pStyle w:val="ListBullet"/>
-      </w:pPr>
-      <w:r>
-        <w:rPr>
-          <w:color w:val="1A1A1A"/>
-          <w:sz w:val="22"/>
-        </w:rPr>
-        <w:t>Bij zone-entry ontvang je automatisch een melding met de beste laadopties.</w:t>
-      </w:r>
-    </w:p>
-    <w:p>
-      <w:pPr>
-        <w:pStyle w:val="ListBullet"/>
-      </w:pPr>
-      <w:r>
-        <w:rPr>
-          <w:color w:val="1A1A1A"/>
-          <w:sz w:val="22"/>
-        </w:rPr>
-        <w:t>Handmatig vernieuwen of een testmelding versturen kan via de button-entiteiten.</w:t>
-      </w:r>
-    </w:p>
-    <w:tbl>
-      <w:tblPr>
-        <w:tblW w:type="auto" w:w="0"/>
-        <w:tblLook w:firstColumn="1" w:firstRow="1" w:lastColumn="0" w:lastRow="0" w:noHBand="0" w:noVBand="1" w:val="04A0"/>
-      </w:tblPr>
-      <w:tblGrid>
-        <w:gridCol w:w="8640"/>
-      </w:tblGrid>
-      <w:tr>
-        <w:tc>
-          <w:tcPr>
-            <w:tcW w:type="dxa" w:w="8640"/>
-            <w:shd w:val="clear" w:color="auto" w:fill="013449"/>
-          </w:tcPr>
-          <w:p>
-            <w:r/>
-            <w:r>
-              <w:rPr>
-                <w:b/>
-                <w:color w:val="FFFFFF"/>
-                <w:sz w:val="36"/>
-              </w:rPr>
-              <w:t>3. Configuratie</w:t>
-            </w:r>
-          </w:p>
-        </w:tc>
-      </w:tr>
-    </w:tbl>
-    <w:p/>
-    <w:p>
-      <w:pPr>
-        <w:spacing w:before="280" w:after="80"/>
-        <w:pBdr>
-          <w:bottom w:val="single" w:sz="12" w:space="4" w:color="38D9E9"/>
-        </w:pBdr>
-      </w:pPr>
-      <w:r>
-        <w:rPr>
-          <w:b/>
-          <w:color w:val="013449"/>
-          <w:sz w:val="28"/>
-        </w:rPr>
-        <w:t>Stap 1 — Zone en provider</w:t>
-      </w:r>
-    </w:p>
-    <w:p>
-      <w:pPr>
-        <w:spacing w:after="160"/>
-      </w:pPr>
-      <w:r>
-        <w:rPr>
-          <w:color w:val="1A1A1A"/>
-          <w:sz w:val="22"/>
-        </w:rPr>
-        <w:t>Kies een bestaande zone en de databron: NDW DOT-NL (gratis, Nederland), TomTom (eigen API-key, wereldwijd) of Open Charge Map (gratis API-key, alleen statische locatiedata). Simulatiemodus gebruikt lokale testdata zonder echte API-calls.</w:t>
-      </w:r>
-    </w:p>
-    <w:p>
-      <w:pPr>
-        <w:spacing w:before="280" w:after="80"/>
-        <w:pBdr>
-          <w:bottom w:val="single" w:sz="12" w:space="4" w:color="38D9E9"/>
-        </w:pBdr>
-      </w:pPr>
-      <w:r>
-        <w:rPr>
-          <w:b/>
-          <w:color w:val="013449"/>
-          <w:sz w:val="28"/>
-        </w:rPr>
-        <w:t>Stap 2 — Gevolgde personen en apparaten</w:t>
-      </w:r>
-    </w:p>
-    <w:p>
-      <w:pPr>
-        <w:spacing w:after="160"/>
-      </w:pPr>
-      <w:r>
-        <w:rPr>
-          <w:color w:val="1A1A1A"/>
-          <w:sz w:val="22"/>
-        </w:rPr>
-        <w:t>Selecteer minimaal één person- of device_tracker-entiteit.</w:t>
-      </w:r>
-    </w:p>
-    <w:p>
-      <w:pPr>
-        <w:spacing w:before="280" w:after="80"/>
-        <w:pBdr>
-          <w:bottom w:val="single" w:sz="12" w:space="4" w:color="38D9E9"/>
-        </w:pBdr>
-      </w:pPr>
-      <w:r>
-        <w:rPr>
-          <w:b/>
-          <w:color w:val="013449"/>
-          <w:sz w:val="28"/>
-        </w:rPr>
-        <w:t>Stap 3 — Zoekopties</w:t>
-      </w:r>
-    </w:p>
-    <w:p>
-      <w:pPr>
-        <w:pStyle w:val="ListBullet"/>
-      </w:pPr>
-      <w:r>
-        <w:rPr>
-          <w:color w:val="1A1A1A"/>
-          <w:sz w:val="22"/>
-        </w:rPr>
-        <w:t>Zoekradius (eigen radius of de radius van de zone zelf)</w:t>
-      </w:r>
-    </w:p>
-    <w:p>
-      <w:pPr>
-        <w:pStyle w:val="ListBullet"/>
-      </w:pPr>
-      <w:r>
-        <w:rPr>
-          <w:color w:val="1A1A1A"/>
-          <w:sz w:val="22"/>
-        </w:rPr>
-        <w:t>Maximaal aantal resultaten</w:t>
-      </w:r>
-    </w:p>
-    <w:p>
-      <w:pPr>
-        <w:pStyle w:val="ListBullet"/>
-      </w:pPr>
-      <w:r>
-        <w:rPr>
-          <w:color w:val="1A1A1A"/>
-          <w:sz w:val="22"/>
-        </w:rPr>
-        <w:t>Connectortypen (leeg = alle)</w:t>
-      </w:r>
-    </w:p>
-    <w:p>
-      <w:pPr>
-        <w:pStyle w:val="ListBullet"/>
-      </w:pPr>
-      <w:r>
-        <w:rPr>
-          <w:color w:val="1A1A1A"/>
-          <w:sz w:val="22"/>
-        </w:rPr>
-        <w:t>Minimaal laadvermogen</w:t>
-      </w:r>
-    </w:p>
-    <w:p>
-      <w:pPr>
-        <w:pStyle w:val="ListBullet"/>
-      </w:pPr>
-      <w:r>
-        <w:rPr>
-          <w:color w:val="1A1A1A"/>
-          <w:sz w:val="22"/>
-        </w:rPr>
-        <w:t>Update-interval</w:t>
-      </w:r>
-    </w:p>
-    <w:p>
-      <w:pPr>
-        <w:pStyle w:val="ListBullet"/>
-      </w:pPr>
-      <w:r>
-        <w:rPr>
-          <w:color w:val="1A1A1A"/>
-          <w:sz w:val="22"/>
-        </w:rPr>
-        <w:t>Maximumleeftijd van data</w:t>
-      </w:r>
-    </w:p>
-    <w:p>
-      <w:pPr>
-        <w:spacing w:before="280" w:after="80"/>
-        <w:pBdr>
-          <w:bottom w:val="single" w:sz="12" w:space="4" w:color="38D9E9"/>
-        </w:pBdr>
-      </w:pPr>
-      <w:r>
-        <w:rPr>
-          <w:b/>
-          <w:color w:val="013449"/>
-          <w:sz w:val="28"/>
-        </w:rPr>
-        <w:t>Stap 4 — Notificaties</w:t>
-      </w:r>
-    </w:p>
-    <w:p>
-      <w:pPr>
-        <w:pStyle w:val="ListBullet"/>
-      </w:pPr>
-      <w:r>
-        <w:rPr>
-          <w:color w:val="1A1A1A"/>
-          <w:sz w:val="22"/>
-        </w:rPr>
-        <w:t>Notificatiedoel (notify-entiteit, apparaat, gebied of label)</w:t>
-      </w:r>
-    </w:p>
-    <w:p>
-      <w:pPr>
-        <w:pStyle w:val="ListBullet"/>
-      </w:pPr>
-      <w:r>
-        <w:rPr>
-          <w:color w:val="1A1A1A"/>
-          <w:sz w:val="22"/>
-        </w:rPr>
-        <w:t>Melding bij zone-entry aan/uit</w:t>
-      </w:r>
-    </w:p>
-    <w:p>
-      <w:pPr>
-        <w:pStyle w:val="ListBullet"/>
-      </w:pPr>
-      <w:r>
-        <w:rPr>
-          <w:color w:val="1A1A1A"/>
-          <w:sz w:val="22"/>
-        </w:rPr>
-        <w:t>Melding bij wijziging beschikbaarheid aan/uit</w:t>
-      </w:r>
-    </w:p>
-    <w:p>
-      <w:pPr>
-        <w:pStyle w:val="ListBullet"/>
-      </w:pPr>
-      <w:r>
-        <w:rPr>
-          <w:color w:val="1A1A1A"/>
-          <w:sz w:val="22"/>
-        </w:rPr>
-        <w:t>Cooldown tussen meldingen</w:t>
-      </w:r>
-    </w:p>
-    <w:p>
-      <w:pPr>
-        <w:pStyle w:val="ListBullet"/>
-      </w:pPr>
-      <w:r>
-        <w:rPr>
-          <w:color w:val="1A1A1A"/>
-          <w:sz w:val="22"/>
-        </w:rPr>
-        <w:t>Taal van de melding (Nederlands/Engels)</w:t>
-      </w:r>
-    </w:p>
-    <w:tbl>
-      <w:tblPr>
-        <w:tblW w:type="auto" w:w="0"/>
-        <w:tblLook w:firstColumn="1" w:firstRow="1" w:lastColumn="0" w:lastRow="0" w:noHBand="0" w:noVBand="1" w:val="04A0"/>
-      </w:tblPr>
-      <w:tblGrid>
-        <w:gridCol w:w="8640"/>
-      </w:tblGrid>
-      <w:tr>
-        <w:tc>
-          <w:tcPr>
-            <w:tcW w:type="dxa" w:w="8640"/>
-            <w:shd w:val="clear" w:color="auto" w:fill="013449"/>
-          </w:tcPr>
-          <w:p>
-            <w:r/>
-            <w:r>
-              <w:rPr>
-                <w:b/>
-                <w:color w:val="FFFFFF"/>
-                <w:sz w:val="36"/>
+                <w:sz w:val="30"/>
               </w:rPr>
               <w:t>4. Sensoren</w:t>
             </w:r>
@@ -494,12 +635,10 @@
             <w:shd w:val="clear" w:color="auto" w:fill="013449"/>
           </w:tcPr>
           <w:p>
-            <w:r/>
             <w:r>
               <w:rPr>
                 <w:b/>
                 <w:color w:val="FFFFFF"/>
-                <w:sz w:val="21"/>
               </w:rPr>
               <w:t>Sensor</w:t>
             </w:r>
@@ -511,12 +650,10 @@
             <w:shd w:val="clear" w:color="auto" w:fill="013449"/>
           </w:tcPr>
           <w:p>
-            <w:r/>
             <w:r>
               <w:rPr>
                 <w:b/>
                 <w:color w:val="FFFFFF"/>
-                <w:sz w:val="21"/>
               </w:rPr>
               <w:t>Beschrijving</w:t>
             </w:r>
@@ -527,13 +664,10 @@
         <w:tc>
           <w:tcPr>
             <w:tcW w:type="dxa" w:w="4320"/>
-            <w:shd w:val="clear" w:color="auto" w:fill="F0F9FF"/>
           </w:tcPr>
           <w:p>
-            <w:r/>
             <w:r>
               <w:rPr>
-                <w:color w:val="1A1A1A"/>
                 <w:sz w:val="20"/>
               </w:rPr>
               <w:t>Beschikbare laadlocaties</w:t>
@@ -543,13 +677,10 @@
         <w:tc>
           <w:tcPr>
             <w:tcW w:type="dxa" w:w="4320"/>
-            <w:shd w:val="clear" w:color="auto" w:fill="F0F9FF"/>
           </w:tcPr>
           <w:p>
-            <w:r/>
             <w:r>
               <w:rPr>
-                <w:color w:val="1A1A1A"/>
                 <w:sz w:val="20"/>
               </w:rPr>
               <w:t>Aantal locaties met minimaal één vrije aansluiting</w:t>
@@ -561,13 +692,10 @@
         <w:tc>
           <w:tcPr>
             <w:tcW w:type="dxa" w:w="4320"/>
-            <w:shd w:val="clear" w:color="auto" w:fill="F0F9FF"/>
           </w:tcPr>
           <w:p>
-            <w:r/>
             <w:r>
               <w:rPr>
-                <w:color w:val="1A1A1A"/>
                 <w:sz w:val="20"/>
               </w:rPr>
               <w:t>Beschikbare aansluitingen</w:t>
@@ -577,16 +705,13 @@
         <w:tc>
           <w:tcPr>
             <w:tcW w:type="dxa" w:w="4320"/>
-            <w:shd w:val="clear" w:color="auto" w:fill="F0F9FF"/>
           </w:tcPr>
           <w:p>
-            <w:r/>
             <w:r>
               <w:rPr>
-                <w:color w:val="1A1A1A"/>
                 <w:sz w:val="20"/>
               </w:rPr>
-              <w:t>Totaal aantal vrije aansluitingen</w:t>
+              <w:t>Totaal aantal vrije aansluitingen over alle locaties</w:t>
             </w:r>
           </w:p>
         </w:tc>
@@ -595,13 +720,80 @@
         <w:tc>
           <w:tcPr>
             <w:tcW w:type="dxa" w:w="4320"/>
-            <w:shd w:val="clear" w:color="auto" w:fill="F0F9FF"/>
           </w:tcPr>
           <w:p>
-            <w:r/>
             <w:r>
               <w:rPr>
-                <w:color w:val="1A1A1A"/>
+                <w:sz w:val="20"/>
+              </w:rPr>
+              <w:t xml:space="preserve">Totaal aantal laadlocaties </w:t>
+            </w:r>
+            <w:r>
+              <w:rPr>
+                <w:i/>
+                <w:sz w:val="20"/>
+              </w:rPr>
+              <w:t>(standaard uit)</w:t>
+            </w:r>
+          </w:p>
+        </w:tc>
+        <w:tc>
+          <w:tcPr>
+            <w:tcW w:type="dxa" w:w="4320"/>
+          </w:tcPr>
+          <w:p>
+            <w:r>
+              <w:rPr>
+                <w:sz w:val="20"/>
+              </w:rPr>
+              <w:t>Alle gevonden locaties, ongeacht beschikbaarheid</w:t>
+            </w:r>
+          </w:p>
+        </w:tc>
+      </w:tr>
+      <w:tr>
+        <w:tc>
+          <w:tcPr>
+            <w:tcW w:type="dxa" w:w="4320"/>
+          </w:tcPr>
+          <w:p>
+            <w:r>
+              <w:rPr>
+                <w:sz w:val="20"/>
+              </w:rPr>
+              <w:t xml:space="preserve">Totaal aantal aansluitingen </w:t>
+            </w:r>
+            <w:r>
+              <w:rPr>
+                <w:i/>
+                <w:sz w:val="20"/>
+              </w:rPr>
+              <w:t>(standaard uit)</w:t>
+            </w:r>
+          </w:p>
+        </w:tc>
+        <w:tc>
+          <w:tcPr>
+            <w:tcW w:type="dxa" w:w="4320"/>
+          </w:tcPr>
+          <w:p>
+            <w:r>
+              <w:rPr>
+                <w:sz w:val="20"/>
+              </w:rPr>
+              <w:t>Alle aansluitingen over alle locaties</w:t>
+            </w:r>
+          </w:p>
+        </w:tc>
+      </w:tr>
+      <w:tr>
+        <w:tc>
+          <w:tcPr>
+            <w:tcW w:type="dxa" w:w="4320"/>
+          </w:tcPr>
+          <w:p>
+            <w:r>
+              <w:rPr>
                 <w:sz w:val="20"/>
               </w:rPr>
               <w:t>Beste laadlocatie</w:t>
@@ -611,13 +803,10 @@
         <w:tc>
           <w:tcPr>
             <w:tcW w:type="dxa" w:w="4320"/>
-            <w:shd w:val="clear" w:color="auto" w:fill="F0F9FF"/>
           </w:tcPr>
           <w:p>
-            <w:r/>
             <w:r>
               <w:rPr>
-                <w:color w:val="1A1A1A"/>
                 <w:sz w:val="20"/>
               </w:rPr>
               <w:t>Naam van de best gesorteerde locatie</w:t>
@@ -629,13 +818,10 @@
         <w:tc>
           <w:tcPr>
             <w:tcW w:type="dxa" w:w="4320"/>
-            <w:shd w:val="clear" w:color="auto" w:fill="F0F9FF"/>
           </w:tcPr>
           <w:p>
-            <w:r/>
             <w:r>
               <w:rPr>
-                <w:color w:val="1A1A1A"/>
                 <w:sz w:val="20"/>
               </w:rPr>
               <w:t>Afstand tot beste locatie</w:t>
@@ -645,13 +831,10 @@
         <w:tc>
           <w:tcPr>
             <w:tcW w:type="dxa" w:w="4320"/>
-            <w:shd w:val="clear" w:color="auto" w:fill="F0F9FF"/>
           </w:tcPr>
           <w:p>
-            <w:r/>
             <w:r>
               <w:rPr>
-                <w:color w:val="1A1A1A"/>
                 <w:sz w:val="20"/>
               </w:rPr>
               <w:t>In meters</w:t>
@@ -663,13 +846,10 @@
         <w:tc>
           <w:tcPr>
             <w:tcW w:type="dxa" w:w="4320"/>
-            <w:shd w:val="clear" w:color="auto" w:fill="F0F9FF"/>
           </w:tcPr>
           <w:p>
-            <w:r/>
             <w:r>
               <w:rPr>
-                <w:color w:val="1A1A1A"/>
                 <w:sz w:val="20"/>
               </w:rPr>
               <w:t>Max. vermogen beste locatie</w:t>
@@ -679,13 +859,10 @@
         <w:tc>
           <w:tcPr>
             <w:tcW w:type="dxa" w:w="4320"/>
-            <w:shd w:val="clear" w:color="auto" w:fill="F0F9FF"/>
           </w:tcPr>
           <w:p>
-            <w:r/>
             <w:r>
               <w:rPr>
-                <w:color w:val="1A1A1A"/>
                 <w:sz w:val="20"/>
               </w:rPr>
               <w:t>In kW</w:t>
@@ -697,29 +874,86 @@
         <w:tc>
           <w:tcPr>
             <w:tcW w:type="dxa" w:w="4320"/>
-            <w:shd w:val="clear" w:color="auto" w:fill="F0F9FF"/>
           </w:tcPr>
           <w:p>
-            <w:r/>
             <w:r>
               <w:rPr>
-                <w:color w:val="1A1A1A"/>
                 <w:sz w:val="20"/>
               </w:rPr>
-              <w:t>Navigatielink</w:t>
+              <w:t xml:space="preserve">Operator beste locatie </w:t>
+            </w:r>
+            <w:r>
+              <w:rPr>
+                <w:i/>
+                <w:sz w:val="20"/>
+              </w:rPr>
+              <w:t>(standaard uit)</w:t>
             </w:r>
           </w:p>
         </w:tc>
         <w:tc>
           <w:tcPr>
             <w:tcW w:type="dxa" w:w="4320"/>
-            <w:shd w:val="clear" w:color="auto" w:fill="F0F9FF"/>
+          </w:tcPr>
+          <w:p/>
+        </w:tc>
+      </w:tr>
+      <w:tr>
+        <w:tc>
+          <w:tcPr>
+            <w:tcW w:type="dxa" w:w="4320"/>
           </w:tcPr>
           <w:p>
-            <w:r/>
             <w:r>
               <w:rPr>
-                <w:color w:val="1A1A1A"/>
+                <w:sz w:val="20"/>
+              </w:rPr>
+              <w:t xml:space="preserve">Adres beste locatie </w:t>
+            </w:r>
+            <w:r>
+              <w:rPr>
+                <w:i/>
+                <w:sz w:val="20"/>
+              </w:rPr>
+              <w:t>(standaard uit)</w:t>
+            </w:r>
+          </w:p>
+        </w:tc>
+        <w:tc>
+          <w:tcPr>
+            <w:tcW w:type="dxa" w:w="4320"/>
+          </w:tcPr>
+          <w:p/>
+        </w:tc>
+      </w:tr>
+      <w:tr>
+        <w:tc>
+          <w:tcPr>
+            <w:tcW w:type="dxa" w:w="4320"/>
+          </w:tcPr>
+          <w:p>
+            <w:r>
+              <w:rPr>
+                <w:sz w:val="20"/>
+              </w:rPr>
+              <w:t xml:space="preserve">Navigatielink </w:t>
+            </w:r>
+            <w:r>
+              <w:rPr>
+                <w:i/>
+                <w:sz w:val="20"/>
+              </w:rPr>
+              <w:t>(standaard uit)</w:t>
+            </w:r>
+          </w:p>
+        </w:tc>
+        <w:tc>
+          <w:tcPr>
+            <w:tcW w:type="dxa" w:w="4320"/>
+          </w:tcPr>
+          <w:p>
+            <w:r>
+              <w:rPr>
                 <w:sz w:val="20"/>
               </w:rPr>
               <w:t>Google Maps-link naar de beste locatie</w:t>
@@ -731,13 +965,10 @@
         <w:tc>
           <w:tcPr>
             <w:tcW w:type="dxa" w:w="4320"/>
-            <w:shd w:val="clear" w:color="auto" w:fill="F0F9FF"/>
           </w:tcPr>
           <w:p>
-            <w:r/>
             <w:r>
               <w:rPr>
-                <w:color w:val="1A1A1A"/>
                 <w:sz w:val="20"/>
               </w:rPr>
               <w:t>Laatste succesvolle update</w:t>
@@ -747,13 +978,10 @@
         <w:tc>
           <w:tcPr>
             <w:tcW w:type="dxa" w:w="4320"/>
-            <w:shd w:val="clear" w:color="auto" w:fill="F0F9FF"/>
           </w:tcPr>
           <w:p>
-            <w:r/>
             <w:r>
               <w:rPr>
-                <w:color w:val="1A1A1A"/>
                 <w:sz w:val="20"/>
               </w:rPr>
               <w:t>Tijdstip van de laatst gelukte databevraging</w:t>
@@ -765,13 +993,45 @@
         <w:tc>
           <w:tcPr>
             <w:tcW w:type="dxa" w:w="4320"/>
-            <w:shd w:val="clear" w:color="auto" w:fill="F0F9FF"/>
           </w:tcPr>
           <w:p>
-            <w:r/>
             <w:r>
               <w:rPr>
-                <w:color w:val="1A1A1A"/>
+                <w:sz w:val="20"/>
+              </w:rPr>
+              <w:t xml:space="preserve">Databron </w:t>
+            </w:r>
+            <w:r>
+              <w:rPr>
+                <w:i/>
+                <w:sz w:val="20"/>
+              </w:rPr>
+              <w:t>(standaard uit)</w:t>
+            </w:r>
+          </w:p>
+        </w:tc>
+        <w:tc>
+          <w:tcPr>
+            <w:tcW w:type="dxa" w:w="4320"/>
+          </w:tcPr>
+          <w:p>
+            <w:r>
+              <w:rPr>
+                <w:sz w:val="20"/>
+              </w:rPr>
+              <w:t>Naam van de actieve provider</w:t>
+            </w:r>
+          </w:p>
+        </w:tc>
+      </w:tr>
+      <w:tr>
+        <w:tc>
+          <w:tcPr>
+            <w:tcW w:type="dxa" w:w="4320"/>
+          </w:tcPr>
+          <w:p>
+            <w:r>
+              <w:rPr>
                 <w:sz w:val="20"/>
               </w:rPr>
               <w:t>API-status</w:t>
@@ -781,25 +1041,96 @@
         <w:tc>
           <w:tcPr>
             <w:tcW w:type="dxa" w:w="4320"/>
-            <w:shd w:val="clear" w:color="auto" w:fill="F0F9FF"/>
           </w:tcPr>
           <w:p>
-            <w:r/>
             <w:r>
               <w:rPr>
-                <w:color w:val="1A1A1A"/>
+                <w:rFonts w:ascii="Consolas" w:hAnsi="Consolas"/>
                 <w:sz w:val="20"/>
               </w:rPr>
-              <w:t>ok / cannot_connect / invalid_auth / rate_limited / unknown</w:t>
+              <w:t>ok</w:t>
+            </w:r>
+            <w:r>
+              <w:rPr>
+                <w:sz w:val="20"/>
+              </w:rPr>
+              <w:t xml:space="preserve">, </w:t>
+            </w:r>
+            <w:r>
+              <w:rPr>
+                <w:rFonts w:ascii="Consolas" w:hAnsi="Consolas"/>
+                <w:sz w:val="20"/>
+              </w:rPr>
+              <w:t>cannot_connect</w:t>
+            </w:r>
+            <w:r>
+              <w:rPr>
+                <w:sz w:val="20"/>
+              </w:rPr>
+              <w:t xml:space="preserve">, </w:t>
+            </w:r>
+            <w:r>
+              <w:rPr>
+                <w:rFonts w:ascii="Consolas" w:hAnsi="Consolas"/>
+                <w:sz w:val="20"/>
+              </w:rPr>
+              <w:t>invalid_auth</w:t>
+            </w:r>
+            <w:r>
+              <w:rPr>
+                <w:sz w:val="20"/>
+              </w:rPr>
+              <w:t xml:space="preserve">, </w:t>
+            </w:r>
+            <w:r>
+              <w:rPr>
+                <w:rFonts w:ascii="Consolas" w:hAnsi="Consolas"/>
+                <w:sz w:val="20"/>
+              </w:rPr>
+              <w:t>rate_limited</w:t>
+            </w:r>
+            <w:r>
+              <w:rPr>
+                <w:sz w:val="20"/>
+              </w:rPr>
+              <w:t xml:space="preserve"> of </w:t>
+            </w:r>
+            <w:r>
+              <w:rPr>
+                <w:rFonts w:ascii="Consolas" w:hAnsi="Consolas"/>
+                <w:sz w:val="20"/>
+              </w:rPr>
+              <w:t>unknown</w:t>
             </w:r>
           </w:p>
         </w:tc>
       </w:tr>
     </w:tbl>
     <w:p/>
+    <w:p>
+      <w:r>
+        <w:t xml:space="preserve">De sensor "Beschikbare laadlocaties" heeft een attribuut </w:t>
+      </w:r>
+      <w:r>
+        <w:rPr>
+          <w:rFonts w:ascii="Consolas" w:hAnsi="Consolas"/>
+          <w:sz w:val="20"/>
+        </w:rPr>
+        <w:t>top_locations</w:t>
+      </w:r>
+      <w:r>
+        <w:t xml:space="preserve"> met een compacte lijst (max. 5) van naam, adres, afstand, beschikbaarheid en vermogen — handig voor eigen dashboardkaarten of automatiseringen.</w:t>
+      </w:r>
+    </w:p>
+    <w:p>
+      <w:r>
+        <w:t>Standaard uitgeschakelde sensoren kun je alsnog activeren via de entiteiteninstellingen.</w:t>
+      </w:r>
+    </w:p>
     <w:tbl>
       <w:tblPr>
         <w:tblW w:type="auto" w:w="0"/>
+        <w:tblLayout w:type="autofit"/>
         <w:tblLook w:firstColumn="1" w:firstRow="1" w:lastColumn="0" w:lastRow="0" w:noHBand="0" w:noVBand="1" w:val="04A0"/>
       </w:tblPr>
       <w:tblGrid>
@@ -812,14 +1143,170 @@
             <w:shd w:val="clear" w:color="auto" w:fill="013449"/>
           </w:tcPr>
           <w:p>
-            <w:r/>
             <w:r>
               <w:rPr>
                 <w:b/>
                 <w:color w:val="FFFFFF"/>
-                <w:sz w:val="36"/>
+                <w:sz w:val="30"/>
               </w:rPr>
-              <w:t>5. Binary sensors, button en events</w:t>
+              <w:t>5. Binary sensors</w:t>
+            </w:r>
+          </w:p>
+        </w:tc>
+      </w:tr>
+    </w:tbl>
+    <w:p/>
+    <w:tbl>
+      <w:tblPr>
+        <w:tblStyle w:val="TableGrid"/>
+        <w:tblW w:type="auto" w:w="0"/>
+        <w:tblLook w:firstColumn="1" w:firstRow="1" w:lastColumn="0" w:lastRow="0" w:noHBand="0" w:noVBand="1" w:val="04A0"/>
+      </w:tblPr>
+      <w:tblGrid>
+        <w:gridCol w:w="4320"/>
+        <w:gridCol w:w="4320"/>
+      </w:tblGrid>
+      <w:tr>
+        <w:tc>
+          <w:tcPr>
+            <w:tcW w:type="dxa" w:w="4320"/>
+            <w:shd w:val="clear" w:color="auto" w:fill="013449"/>
+          </w:tcPr>
+          <w:p>
+            <w:r>
+              <w:rPr>
+                <w:b/>
+                <w:color w:val="FFFFFF"/>
+              </w:rPr>
+              <w:t>Binary sensor</w:t>
+            </w:r>
+          </w:p>
+        </w:tc>
+        <w:tc>
+          <w:tcPr>
+            <w:tcW w:type="dxa" w:w="4320"/>
+            <w:shd w:val="clear" w:color="auto" w:fill="013449"/>
+          </w:tcPr>
+          <w:p>
+            <w:r>
+              <w:rPr>
+                <w:b/>
+                <w:color w:val="FFFFFF"/>
+              </w:rPr>
+              <w:t>Aan wanneer...</w:t>
+            </w:r>
+          </w:p>
+        </w:tc>
+      </w:tr>
+      <w:tr>
+        <w:tc>
+          <w:tcPr>
+            <w:tcW w:type="dxa" w:w="4320"/>
+          </w:tcPr>
+          <w:p>
+            <w:r>
+              <w:rPr>
+                <w:sz w:val="20"/>
+              </w:rPr>
+              <w:t>Laadlocatie beschikbaar</w:t>
+            </w:r>
+          </w:p>
+        </w:tc>
+        <w:tc>
+          <w:tcPr>
+            <w:tcW w:type="dxa" w:w="4320"/>
+          </w:tcPr>
+          <w:p>
+            <w:r>
+              <w:rPr>
+                <w:sz w:val="20"/>
+              </w:rPr>
+              <w:t>Minimaal één locatie binnen de radius vrij is</w:t>
+            </w:r>
+          </w:p>
+        </w:tc>
+      </w:tr>
+      <w:tr>
+        <w:tc>
+          <w:tcPr>
+            <w:tcW w:type="dxa" w:w="4320"/>
+          </w:tcPr>
+          <w:p>
+            <w:r>
+              <w:rPr>
+                <w:sz w:val="20"/>
+              </w:rPr>
+              <w:t>API beschikbaar</w:t>
+            </w:r>
+          </w:p>
+        </w:tc>
+        <w:tc>
+          <w:tcPr>
+            <w:tcW w:type="dxa" w:w="4320"/>
+          </w:tcPr>
+          <w:p>
+            <w:r>
+              <w:rPr>
+                <w:sz w:val="20"/>
+              </w:rPr>
+              <w:t>De laatste providercall succesvol was</w:t>
+            </w:r>
+          </w:p>
+        </w:tc>
+      </w:tr>
+      <w:tr>
+        <w:tc>
+          <w:tcPr>
+            <w:tcW w:type="dxa" w:w="4320"/>
+          </w:tcPr>
+          <w:p>
+            <w:r>
+              <w:rPr>
+                <w:sz w:val="20"/>
+              </w:rPr>
+              <w:t>Data verouderd</w:t>
+            </w:r>
+          </w:p>
+        </w:tc>
+        <w:tc>
+          <w:tcPr>
+            <w:tcW w:type="dxa" w:w="4320"/>
+          </w:tcPr>
+          <w:p>
+            <w:r>
+              <w:rPr>
+                <w:sz w:val="20"/>
+              </w:rPr>
+              <w:t>De laatst opgehaalde data ouder is dan de ingestelde maximumleeftijd</w:t>
+            </w:r>
+          </w:p>
+        </w:tc>
+      </w:tr>
+    </w:tbl>
+    <w:p/>
+    <w:tbl>
+      <w:tblPr>
+        <w:tblW w:type="auto" w:w="0"/>
+        <w:tblLayout w:type="autofit"/>
+        <w:tblLook w:firstColumn="1" w:firstRow="1" w:lastColumn="0" w:lastRow="0" w:noHBand="0" w:noVBand="1" w:val="04A0"/>
+      </w:tblPr>
+      <w:tblGrid>
+        <w:gridCol w:w="8640"/>
+      </w:tblGrid>
+      <w:tr>
+        <w:tc>
+          <w:tcPr>
+            <w:tcW w:type="dxa" w:w="8640"/>
+            <w:shd w:val="clear" w:color="auto" w:fill="013449"/>
+          </w:tcPr>
+          <w:p>
+            <w:r>
+              <w:rPr>
+                <w:b/>
+                <w:color w:val="FFFFFF"/>
+                <w:sz w:val="30"/>
+              </w:rPr>
+              <w:t>6. Button</w:t>
             </w:r>
           </w:p>
         </w:tc>
@@ -832,10 +1319,12 @@
       </w:pPr>
       <w:r>
         <w:rPr>
-          <w:color w:val="1A1A1A"/>
-          <w:sz w:val="22"/>
+          <w:b/>
         </w:rPr>
-        <w:t>Binary sensors: Laadlocatie beschikbaar, API beschikbaar, Data verouderd.</w:t>
+        <w:t>Vernieuwen</w:t>
+      </w:r>
+      <w:r>
+        <w:t xml:space="preserve"> — forceert direct een nieuwe databevraging.</w:t>
       </w:r>
     </w:p>
     <w:p>
@@ -844,27 +1333,23 @@
       </w:pPr>
       <w:r>
         <w:rPr>
-          <w:color w:val="1A1A1A"/>
-          <w:sz w:val="22"/>
+          <w:b/>
         </w:rPr>
-        <w:t>Buttons: Vernieuwen, Testmelding versturen.</w:t>
+        <w:t>Testmelding versturen</w:t>
+      </w:r>
+      <w:r>
+        <w:t xml:space="preserve"> — verstuurt direct een melding met de huidige</w:t>
       </w:r>
     </w:p>
     <w:p>
-      <w:pPr>
-        <w:pStyle w:val="ListBullet"/>
-      </w:pPr>
       <w:r>
-        <w:rPr>
-          <w:color w:val="1A1A1A"/>
-          <w:sz w:val="22"/>
-        </w:rPr>
-        <w:t>Events: zone_entered, availability_changed, charger_available, provider_unavailable.</w:t>
+        <w:t>data, zonder rekening te houden met de cooldown of de zone-entry-toggle.</w:t>
       </w:r>
     </w:p>
     <w:tbl>
       <w:tblPr>
         <w:tblW w:type="auto" w:w="0"/>
+        <w:tblLayout w:type="autofit"/>
         <w:tblLook w:firstColumn="1" w:firstRow="1" w:lastColumn="0" w:lastRow="0" w:noHBand="0" w:noVBand="1" w:val="04A0"/>
       </w:tblPr>
       <w:tblGrid>
@@ -877,20 +1362,150 @@
             <w:shd w:val="clear" w:color="auto" w:fill="013449"/>
           </w:tcPr>
           <w:p>
-            <w:r/>
             <w:r>
               <w:rPr>
                 <w:b/>
                 <w:color w:val="FFFFFF"/>
-                <w:sz w:val="36"/>
+                <w:sz w:val="30"/>
               </w:rPr>
-              <w:t>6. Voorbeeldmeldingen</w:t>
+              <w:t>7. Events</w:t>
             </w:r>
           </w:p>
         </w:tc>
       </w:tr>
     </w:tbl>
     <w:p/>
+    <w:p>
+      <w:r>
+        <w:t xml:space="preserve">De event-entiteit </w:t>
+      </w:r>
+      <w:r>
+        <w:rPr>
+          <w:b/>
+        </w:rPr>
+        <w:t>Activiteit</w:t>
+      </w:r>
+      <w:r>
+        <w:t xml:space="preserve"> signaleert:</w:t>
+      </w:r>
+    </w:p>
+    <w:p>
+      <w:pPr>
+        <w:pStyle w:val="ListBullet"/>
+      </w:pPr>
+      <w:r>
+        <w:rPr>
+          <w:rFonts w:ascii="Consolas" w:hAnsi="Consolas"/>
+          <w:sz w:val="20"/>
+        </w:rPr>
+        <w:t>zone_entered</w:t>
+      </w:r>
+      <w:r>
+        <w:t xml:space="preserve"> — een gevolgde persoon/tracker is de zone binnengekomen.</w:t>
+      </w:r>
+    </w:p>
+    <w:p>
+      <w:pPr>
+        <w:pStyle w:val="ListBullet"/>
+      </w:pPr>
+      <w:r>
+        <w:rPr>
+          <w:rFonts w:ascii="Consolas" w:hAnsi="Consolas"/>
+          <w:sz w:val="20"/>
+        </w:rPr>
+        <w:t>availability_changed</w:t>
+      </w:r>
+      <w:r>
+        <w:t xml:space="preserve"> — het aantal beschikbare aansluitingen is gewijzigd.</w:t>
+      </w:r>
+    </w:p>
+    <w:p>
+      <w:pPr>
+        <w:pStyle w:val="ListBullet"/>
+      </w:pPr>
+      <w:r>
+        <w:rPr>
+          <w:rFonts w:ascii="Consolas" w:hAnsi="Consolas"/>
+          <w:sz w:val="20"/>
+        </w:rPr>
+        <w:t>charger_available</w:t>
+      </w:r>
+      <w:r>
+        <w:t xml:space="preserve"> — er kwam een aansluiting beschikbaar terwijl er</w:t>
+      </w:r>
+    </w:p>
+    <w:p>
+      <w:r>
+        <w:t>daarvoor nul beschikbaar waren.</w:t>
+      </w:r>
+    </w:p>
+    <w:p>
+      <w:pPr>
+        <w:pStyle w:val="ListBullet"/>
+      </w:pPr>
+      <w:r>
+        <w:rPr>
+          <w:rFonts w:ascii="Consolas" w:hAnsi="Consolas"/>
+          <w:sz w:val="20"/>
+        </w:rPr>
+        <w:t>provider_unavailable</w:t>
+      </w:r>
+      <w:r>
+        <w:t xml:space="preserve"> — de provider is meerdere pogingen achtereen</w:t>
+      </w:r>
+    </w:p>
+    <w:p>
+      <w:r>
+        <w:t>onbereikbaar.</w:t>
+      </w:r>
+    </w:p>
+    <w:p>
+      <w:r>
+        <w:t>Deze events zijn bruikbaar als trigger in eigen automatiseringen, los van de ingebouwde notificatielogica.</w:t>
+      </w:r>
+    </w:p>
+    <w:tbl>
+      <w:tblPr>
+        <w:tblW w:type="auto" w:w="0"/>
+        <w:tblLayout w:type="autofit"/>
+        <w:tblLook w:firstColumn="1" w:firstRow="1" w:lastColumn="0" w:lastRow="0" w:noHBand="0" w:noVBand="1" w:val="04A0"/>
+      </w:tblPr>
+      <w:tblGrid>
+        <w:gridCol w:w="8640"/>
+      </w:tblGrid>
+      <w:tr>
+        <w:tc>
+          <w:tcPr>
+            <w:tcW w:type="dxa" w:w="8640"/>
+            <w:shd w:val="clear" w:color="auto" w:fill="013449"/>
+          </w:tcPr>
+          <w:p>
+            <w:r>
+              <w:rPr>
+                <w:b/>
+                <w:color w:val="FFFFFF"/>
+                <w:sz w:val="30"/>
+              </w:rPr>
+              <w:t>8. Notificaties</w:t>
+            </w:r>
+          </w:p>
+        </w:tc>
+      </w:tr>
+    </w:tbl>
+    <w:p/>
+    <w:p>
+      <w:r>
+        <w:t>Bij een zone-entry (of via de testknop) ontvang je één van drie berichtvarianten, afhankelijk van de actuele data:</w:t>
+      </w:r>
+    </w:p>
+    <w:p>
+      <w:r>
+        <w:rPr>
+          <w:b/>
+        </w:rPr>
+        <w:t>Beschikbare laadpunten:</w:t>
+      </w:r>
+    </w:p>
     <w:tbl>
       <w:tblPr>
         <w:tblW w:type="auto" w:w="0"/>
@@ -906,37 +1521,121 @@
             <w:shd w:val="clear" w:color="auto" w:fill="F0F9FF"/>
           </w:tcPr>
           <w:p>
-            <w:r/>
             <w:r>
               <w:rPr>
-                <w:b/>
-                <w:color w:val="013449"/>
-                <w:sz w:val="22"/>
+                <w:rFonts w:ascii="Consolas" w:hAnsi="Consolas"/>
+                <w:sz w:val="19"/>
               </w:rPr>
-              <w:t>Beschikbare laadpunten</w:t>
+              <w:t>Laadpunten in de buurt van Woonwijk</w:t>
+            </w:r>
+            <w:r>
               <w:br/>
             </w:r>
             <w:r>
               <w:rPr>
                 <w:rFonts w:ascii="Consolas" w:hAnsi="Consolas"/>
-                <w:color w:val="1A1A1A"/>
-                <w:sz w:val="21"/>
+                <w:sz w:val="19"/>
               </w:rPr>
-              <w:t>Laadpunten in de buurt van Woonwijk</w:t>
+              <w:t xml:space="preserve"> </w:t>
+            </w:r>
+            <w:r>
               <w:br/>
+            </w:r>
+            <w:r>
+              <w:rPr>
+                <w:rFonts w:ascii="Consolas" w:hAnsi="Consolas"/>
+                <w:sz w:val="19"/>
+              </w:rPr>
+              <w:t>Er zijn 3 laadlocaties met in totaal 7 vrije aansluitingen.</w:t>
+            </w:r>
+            <w:r>
               <w:br/>
-              <w:t>Er zijn 3 laadlocaties met in totaal 7 vrije aansluitingen.</w:t>
+            </w:r>
+            <w:r>
+              <w:rPr>
+                <w:rFonts w:ascii="Consolas" w:hAnsi="Consolas"/>
+                <w:sz w:val="19"/>
+              </w:rPr>
+              <w:t xml:space="preserve"> </w:t>
+            </w:r>
+            <w:r>
               <w:br/>
+            </w:r>
+            <w:r>
+              <w:rPr>
+                <w:rFonts w:ascii="Consolas" w:hAnsi="Consolas"/>
+                <w:sz w:val="19"/>
+              </w:rPr>
+              <w:t>1. P+R Centrum</w:t>
+            </w:r>
+            <w:r>
               <w:br/>
-              <w:t>1. P+R Centrum</w:t>
+            </w:r>
+            <w:r>
+              <w:rPr>
+                <w:rFonts w:ascii="Consolas" w:hAnsi="Consolas"/>
+                <w:sz w:val="19"/>
+              </w:rPr>
+              <w:t xml:space="preserve">   3 van 6 beschikbaar</w:t>
+            </w:r>
+            <w:r>
               <w:br/>
-              <w:t xml:space="preserve">   3 van 6 beschikbaar</w:t>
+            </w:r>
+            <w:r>
+              <w:rPr>
+                <w:rFonts w:ascii="Consolas" w:hAnsi="Consolas"/>
+                <w:sz w:val="19"/>
+              </w:rPr>
+              <w:t xml:space="preserve">   Type 2 · maximaal 22 kW</w:t>
+            </w:r>
+            <w:r>
               <w:br/>
-              <w:t xml:space="preserve">   Type 2 · maximaal 22 kW</w:t>
+            </w:r>
+            <w:r>
+              <w:rPr>
+                <w:rFonts w:ascii="Consolas" w:hAnsi="Consolas"/>
+                <w:sz w:val="19"/>
+              </w:rPr>
+              <w:t xml:space="preserve">   280 meter afstand</w:t>
+            </w:r>
+            <w:r>
               <w:br/>
-              <w:t xml:space="preserve">   280 meter afstand</w:t>
+            </w:r>
+            <w:r>
+              <w:rPr>
+                <w:rFonts w:ascii="Consolas" w:hAnsi="Consolas"/>
+                <w:sz w:val="19"/>
+              </w:rPr>
+              <w:t xml:space="preserve"> </w:t>
+            </w:r>
+            <w:r>
               <w:br/>
+            </w:r>
+            <w:r>
+              <w:rPr>
+                <w:rFonts w:ascii="Consolas" w:hAnsi="Consolas"/>
+                <w:sz w:val="19"/>
+              </w:rPr>
+              <w:t>...</w:t>
+            </w:r>
+            <w:r>
               <w:br/>
+            </w:r>
+            <w:r>
+              <w:rPr>
+                <w:rFonts w:ascii="Consolas" w:hAnsi="Consolas"/>
+                <w:sz w:val="19"/>
+              </w:rPr>
+              <w:t xml:space="preserve"> </w:t>
+            </w:r>
+            <w:r>
+              <w:br/>
+            </w:r>
+            <w:r>
+              <w:rPr>
+                <w:rFonts w:ascii="Consolas" w:hAnsi="Consolas"/>
+                <w:sz w:val="19"/>
+              </w:rPr>
               <w:t>Bijgewerkt om 16:32 via NDW DOT-NL.</w:t>
             </w:r>
           </w:p>
@@ -944,6 +1643,14 @@
       </w:tr>
     </w:tbl>
     <w:p/>
+    <w:p>
+      <w:r>
+        <w:rPr>
+          <w:b/>
+        </w:rPr>
+        <w:t>Geen beschikbare laadpunten:</w:t>
+      </w:r>
+    </w:p>
     <w:tbl>
       <w:tblPr>
         <w:tblW w:type="auto" w:w="0"/>
@@ -959,25 +1666,31 @@
             <w:shd w:val="clear" w:color="auto" w:fill="F0F9FF"/>
           </w:tcPr>
           <w:p>
-            <w:r/>
             <w:r>
               <w:rPr>
-                <w:b/>
-                <w:color w:val="013449"/>
-                <w:sz w:val="22"/>
+                <w:rFonts w:ascii="Consolas" w:hAnsi="Consolas"/>
+                <w:sz w:val="19"/>
               </w:rPr>
-              <w:t>Geen beschikbare laadpunten</w:t>
+              <w:t>Er zijn momenteel geen vrije laadpunten binnen 1,5 kilometer van Woonwijk.</w:t>
+            </w:r>
+            <w:r>
               <w:br/>
             </w:r>
             <w:r>
               <w:rPr>
                 <w:rFonts w:ascii="Consolas" w:hAnsi="Consolas"/>
-                <w:color w:val="1A1A1A"/>
-                <w:sz w:val="21"/>
+                <w:sz w:val="19"/>
               </w:rPr>
-              <w:t>Er zijn momenteel geen vrije laadpunten binnen 1,5 kilometer van Woonwijk.</w:t>
+              <w:t xml:space="preserve"> </w:t>
+            </w:r>
+            <w:r>
               <w:br/>
-              <w:br/>
+            </w:r>
+            <w:r>
+              <w:rPr>
+                <w:rFonts w:ascii="Consolas" w:hAnsi="Consolas"/>
+                <w:sz w:val="19"/>
+              </w:rPr>
               <w:t>De status is voor het laatst bijgewerkt om 16:32.</w:t>
             </w:r>
           </w:p>
@@ -985,6 +1698,14 @@
       </w:tr>
     </w:tbl>
     <w:p/>
+    <w:p>
+      <w:r>
+        <w:rPr>
+          <w:b/>
+        </w:rPr>
+        <w:t>Alleen statische data (bv. bij Open Charge Map):</w:t>
+      </w:r>
+    </w:p>
     <w:tbl>
       <w:tblPr>
         <w:tblW w:type="auto" w:w="0"/>
@@ -1000,26 +1721,42 @@
             <w:shd w:val="clear" w:color="auto" w:fill="F0F9FF"/>
           </w:tcPr>
           <w:p>
-            <w:r/>
             <w:r>
               <w:rPr>
-                <w:b/>
-                <w:color w:val="013449"/>
-                <w:sz w:val="22"/>
+                <w:rFonts w:ascii="Consolas" w:hAnsi="Consolas"/>
+                <w:sz w:val="19"/>
               </w:rPr>
-              <w:t>Alleen statische data</w:t>
+              <w:t>Er zijn 5 laadlocaties gevonden, maar de actuele bezetting is niet beschikbaar.</w:t>
+            </w:r>
+            <w:r>
               <w:br/>
             </w:r>
             <w:r>
               <w:rPr>
                 <w:rFonts w:ascii="Consolas" w:hAnsi="Consolas"/>
-                <w:color w:val="1A1A1A"/>
-                <w:sz w:val="21"/>
+                <w:sz w:val="19"/>
               </w:rPr>
-              <w:t>Er zijn 5 laadlocaties gevonden, maar de actuele bezetting is niet beschikbaar.</w:t>
+              <w:t xml:space="preserve"> </w:t>
+            </w:r>
+            <w:r>
               <w:br/>
+            </w:r>
+            <w:r>
+              <w:rPr>
+                <w:rFonts w:ascii="Consolas" w:hAnsi="Consolas"/>
+                <w:sz w:val="19"/>
+              </w:rPr>
+              <w:t>Controleer voor vertrek de laadpaalapp voordat je de laadkabel alvast</w:t>
+            </w:r>
+            <w:r>
               <w:br/>
-              <w:t>Controleer voor vertrek de laadpaalapp voordat je de laadkabel alvast enthousiast uit de kofferbak haalt.</w:t>
+            </w:r>
+            <w:r>
+              <w:rPr>
+                <w:rFonts w:ascii="Consolas" w:hAnsi="Consolas"/>
+                <w:sz w:val="19"/>
+              </w:rPr>
+              <w:t>enthousiast uit de kofferbak haalt.</w:t>
             </w:r>
           </w:p>
         </w:tc>
@@ -1029,6 +1766,7 @@
     <w:tbl>
       <w:tblPr>
         <w:tblW w:type="auto" w:w="0"/>
+        <w:tblLayout w:type="autofit"/>
         <w:tblLook w:firstColumn="1" w:firstRow="1" w:lastColumn="0" w:lastRow="0" w:noHBand="0" w:noVBand="1" w:val="04A0"/>
       </w:tblPr>
       <w:tblGrid>
@@ -1041,14 +1779,13 @@
             <w:shd w:val="clear" w:color="auto" w:fill="013449"/>
           </w:tcPr>
           <w:p>
-            <w:r/>
             <w:r>
               <w:rPr>
                 <w:b/>
                 <w:color w:val="FFFFFF"/>
-                <w:sz w:val="36"/>
+                <w:sz w:val="30"/>
               </w:rPr>
-              <w:t>7. Simulatiemodus</w:t>
+              <w:t>9. Filters</w:t>
             </w:r>
           </w:p>
         </w:tc>
@@ -1057,14 +1794,367 @@
     <w:p/>
     <w:p>
       <w:pPr>
-        <w:spacing w:after="160"/>
+        <w:pStyle w:val="ListBullet"/>
       </w:pPr>
       <w:r>
         <w:rPr>
-          <w:color w:val="1A1A1A"/>
-          <w:sz w:val="22"/>
+          <w:b/>
         </w:rPr>
-        <w:t>Schakel simulatiemodus in om de integratie te testen zonder echte API-calls. Je krijgt drie vaste testlocaties met verschillende beschikbaarheid, duidelijk herkenbaar aan de naam ('Sim ...') en de databron 'Simulatie'.</w:t>
+        <w:t>Connectortypen</w:t>
+      </w:r>
+      <w:r>
+        <w:t>: beperk resultaten tot Type 2, CCS, CHAdeMO, Type 1 of</w:t>
+      </w:r>
+    </w:p>
+    <w:p>
+      <w:r>
+        <w:t>huishoudstekker. Leeg = alle typen.</w:t>
+      </w:r>
+    </w:p>
+    <w:p>
+      <w:pPr>
+        <w:pStyle w:val="ListBullet"/>
+      </w:pPr>
+      <w:r>
+        <w:rPr>
+          <w:b/>
+        </w:rPr>
+        <w:t>Minimaal vermogen</w:t>
+      </w:r>
+      <w:r>
+        <w:t>: verberg locaties onder een ingesteld kW-vermogen.</w:t>
+      </w:r>
+    </w:p>
+    <w:p>
+      <w:pPr>
+        <w:pStyle w:val="ListBullet"/>
+      </w:pPr>
+      <w:r>
+        <w:rPr>
+          <w:b/>
+        </w:rPr>
+        <w:t>Zoekradius</w:t>
+      </w:r>
+      <w:r>
+        <w:t>: eigen radius, of de radius van de gekozen zone.</w:t>
+      </w:r>
+    </w:p>
+    <w:p>
+      <w:pPr>
+        <w:pStyle w:val="ListBullet"/>
+      </w:pPr>
+      <w:r>
+        <w:rPr>
+          <w:b/>
+        </w:rPr>
+        <w:t>Operators uitsluiten</w:t>
+      </w:r>
+      <w:r>
+        <w:t>: verberg specifieke laadnetwerken. Zonder deze</w:t>
+      </w:r>
+    </w:p>
+    <w:p>
+      <w:r>
+        <w:t>filter wordt nooit een merk/operator voorgetrokken — de sortering kijkt uitsluitend naar beschikbaarheid, afstand, vermogen en actualiteit.</w:t>
+      </w:r>
+    </w:p>
+    <w:tbl>
+      <w:tblPr>
+        <w:tblW w:type="auto" w:w="0"/>
+        <w:tblLayout w:type="autofit"/>
+        <w:tblLook w:firstColumn="1" w:firstRow="1" w:lastColumn="0" w:lastRow="0" w:noHBand="0" w:noVBand="1" w:val="04A0"/>
+      </w:tblPr>
+      <w:tblGrid>
+        <w:gridCol w:w="8640"/>
+      </w:tblGrid>
+      <w:tr>
+        <w:tc>
+          <w:tcPr>
+            <w:tcW w:type="dxa" w:w="8640"/>
+            <w:shd w:val="clear" w:color="auto" w:fill="013449"/>
+          </w:tcPr>
+          <w:p>
+            <w:r>
+              <w:rPr>
+                <w:b/>
+                <w:color w:val="FFFFFF"/>
+                <w:sz w:val="30"/>
+              </w:rPr>
+              <w:t>10. Afstand: hemelsbreed of rijafstand</w:t>
+            </w:r>
+          </w:p>
+        </w:tc>
+      </w:tr>
+    </w:tbl>
+    <w:p/>
+    <w:p>
+      <w:r>
+        <w:t xml:space="preserve">Standaard is de getoonde afstand </w:t>
+      </w:r>
+      <w:r>
+        <w:rPr>
+          <w:b/>
+        </w:rPr>
+        <w:t>hemelsbreed</w:t>
+      </w:r>
+      <w:r>
+        <w:t xml:space="preserve"> (rechte lijn) — een bewuste, lichte berekening zonder externe routing-dienst. Klik je op de navigatielink, dan berekent Google Maps daar een échte rijroute voor, die door straten, bochten en eenrichtingsverkeer vrijwel altijd langer is dan de hemelsbrede afstand — dat is normaal, geen fout.</w:t>
+      </w:r>
+    </w:p>
+    <w:p>
+      <w:r>
+        <w:t xml:space="preserve">Wil je dat de getoonde afstand zelf ook een echte rijafstand is, schakel dan "Echte rijafstand gebruiken" in bij de zoekopties en vul een gratis OpenRouteService-API-key in (registreren via </w:t>
+      </w:r>
+      <w:r>
+        <w:rPr>
+          <w:i/>
+        </w:rPr>
+        <w:t>openrouteservice.org (https://openrouteservice.org/dev/#/signup)</w:t>
+      </w:r>
+      <w:r>
+        <w:t>). Dit wordt alleen berekend voor de top-kandidaten na de eerste, hemelsbrede sortering — niet voor elke gevonden locatie — om het aantal externe aanvragen laag te houden.</w:t>
+      </w:r>
+    </w:p>
+    <w:tbl>
+      <w:tblPr>
+        <w:tblW w:type="auto" w:w="0"/>
+        <w:tblLayout w:type="autofit"/>
+        <w:tblLook w:firstColumn="1" w:firstRow="1" w:lastColumn="0" w:lastRow="0" w:noHBand="0" w:noVBand="1" w:val="04A0"/>
+      </w:tblPr>
+      <w:tblGrid>
+        <w:gridCol w:w="8640"/>
+      </w:tblGrid>
+      <w:tr>
+        <w:tc>
+          <w:tcPr>
+            <w:tcW w:type="dxa" w:w="8640"/>
+            <w:shd w:val="clear" w:color="auto" w:fill="013449"/>
+          </w:tcPr>
+          <w:p>
+            <w:r>
+              <w:rPr>
+                <w:b/>
+                <w:color w:val="FFFFFF"/>
+                <w:sz w:val="30"/>
+              </w:rPr>
+              <w:t>11. Routegebaseerd zoeken</w:t>
+            </w:r>
+          </w:p>
+        </w:tc>
+      </w:tr>
+    </w:tbl>
+    <w:p/>
+    <w:p>
+      <w:r>
+        <w:t xml:space="preserve">Standaard wordt gezocht rond één vast punt (de zone). Wil je in plaats daarvan laadpunten zien </w:t>
+      </w:r>
+      <w:r>
+        <w:rPr>
+          <w:b/>
+        </w:rPr>
+        <w:t>langs de route</w:t>
+      </w:r>
+      <w:r>
+        <w:t xml:space="preserve"> naar een tweede zone — bijvoorbeeld onderweg naar werk — stel dan bij de zoekopties een "Bestemmingszone route" in en vul een gratis OpenRouteService-API-key in (dezelfde key als bij "Echte rijafstand gebruiken").</w:t>
+      </w:r>
+    </w:p>
+    <w:p>
+      <w:r>
+        <w:t>Zodra dit is ingesteld:</w:t>
+      </w:r>
+    </w:p>
+    <w:p>
+      <w:pPr>
+        <w:pStyle w:val="ListBullet"/>
+      </w:pPr>
+      <w:r>
+        <w:t>wordt de routegeometrie tussen de zone en de bestemmingszone opgehaald bij</w:t>
+      </w:r>
+    </w:p>
+    <w:p>
+      <w:r>
+        <w:t>OpenRouteService;</w:t>
+      </w:r>
+    </w:p>
+    <w:p>
+      <w:pPr>
+        <w:pStyle w:val="ListBullet"/>
+      </w:pPr>
+      <w:r>
+        <w:t>worden alleen laadpunten getoond die binnen de ingestelde routecorridor</w:t>
+      </w:r>
+    </w:p>
+    <w:p>
+      <w:r>
+        <w:t>liggen (standaard 1000 meter van de route);</w:t>
+      </w:r>
+    </w:p>
+    <w:p>
+      <w:pPr>
+        <w:pStyle w:val="ListBullet"/>
+      </w:pPr>
+      <w:r>
+        <w:t>is de getoonde afstand de afstand vanaf het startpunt, niet vanaf de</w:t>
+      </w:r>
+    </w:p>
+    <w:p>
+      <w:r>
+        <w:t>routelijn.</w:t>
+      </w:r>
+    </w:p>
+    <w:p>
+      <w:r>
+        <w:rPr>
+          <w:b/>
+        </w:rPr>
+        <w:t>Bekende beperking:</w:t>
+      </w:r>
+      <w:r>
+        <w:t xml:space="preserve"> het zoekgebied rond de volledige route wordt begrensd tot maximaal 20 km straal. Voor zeer lange routes (bv. honderden kilometers) worden dus niet alle laadpunten langs de hele route gevonden — dit is voldoende voor de meeste dagelijkse woon-werk-routes, maar geen vervanging voor een volledige routeplanner.</w:t>
+      </w:r>
+    </w:p>
+    <w:p>
+      <w:r>
+        <w:rPr>
+          <w:b/>
+        </w:rPr>
+        <w:t>Geen stille terugval:</w:t>
+      </w:r>
+      <w:r>
+        <w:t xml:space="preserve"> in tegenstelling tot "Echte rijafstand gebruiken" (die bij een fout gewoon de hemelsbrede afstand toont) mislukt de hele update expliciet als de route niet berekend kan worden — bijvoorbeeld bij een ongeldige bestemmingszone of een probleem bij OpenRouteService. De sensor "API-status" en de binary sensor "Data verouderd" laten dit zien.</w:t>
+      </w:r>
+    </w:p>
+    <w:p>
+      <w:r>
+        <w:t>Laat de bestemmingszone leeg om terug te schakelen naar het normale straal-zoekgedrag.</w:t>
+      </w:r>
+    </w:p>
+    <w:tbl>
+      <w:tblPr>
+        <w:tblW w:type="auto" w:w="0"/>
+        <w:tblLayout w:type="autofit"/>
+        <w:tblLook w:firstColumn="1" w:firstRow="1" w:lastColumn="0" w:lastRow="0" w:noHBand="0" w:noVBand="1" w:val="04A0"/>
+      </w:tblPr>
+      <w:tblGrid>
+        <w:gridCol w:w="8640"/>
+      </w:tblGrid>
+      <w:tr>
+        <w:tc>
+          <w:tcPr>
+            <w:tcW w:type="dxa" w:w="8640"/>
+            <w:shd w:val="clear" w:color="auto" w:fill="013449"/>
+          </w:tcPr>
+          <w:p>
+            <w:r>
+              <w:rPr>
+                <w:b/>
+                <w:color w:val="FFFFFF"/>
+                <w:sz w:val="30"/>
+              </w:rPr>
+              <w:t>12. Navigatielinks</w:t>
+            </w:r>
+          </w:p>
+        </w:tc>
+      </w:tr>
+    </w:tbl>
+    <w:p/>
+    <w:p>
+      <w:r>
+        <w:t>Elke laadlocatie krijgt een kant-en-klare Google Maps-navigatielink (</w:t>
+      </w:r>
+      <w:r>
+        <w:rPr>
+          <w:rFonts w:ascii="Consolas" w:hAnsi="Consolas"/>
+          <w:sz w:val="20"/>
+        </w:rPr>
+        <w:t>sensor.navigation_url</w:t>
+      </w:r>
+      <w:r>
+        <w:t xml:space="preserve"> en in elke serviceresponse).</w:t>
+      </w:r>
+    </w:p>
+    <w:tbl>
+      <w:tblPr>
+        <w:tblW w:type="auto" w:w="0"/>
+        <w:tblLayout w:type="autofit"/>
+        <w:tblLook w:firstColumn="1" w:firstRow="1" w:lastColumn="0" w:lastRow="0" w:noHBand="0" w:noVBand="1" w:val="04A0"/>
+      </w:tblPr>
+      <w:tblGrid>
+        <w:gridCol w:w="8640"/>
+      </w:tblGrid>
+      <w:tr>
+        <w:tc>
+          <w:tcPr>
+            <w:tcW w:type="dxa" w:w="8640"/>
+            <w:shd w:val="clear" w:color="auto" w:fill="013449"/>
+          </w:tcPr>
+          <w:p>
+            <w:r>
+              <w:rPr>
+                <w:b/>
+                <w:color w:val="FFFFFF"/>
+                <w:sz w:val="30"/>
+              </w:rPr>
+              <w:t>13. Laadlocaties op de kaart</w:t>
+            </w:r>
+          </w:p>
+        </w:tc>
+      </w:tr>
+    </w:tbl>
+    <w:p/>
+    <w:p>
+      <w:r>
+        <w:t xml:space="preserve">Naast de sensoren maakt de integratie tot </w:t>
+      </w:r>
+      <w:r>
+        <w:rPr>
+          <w:rFonts w:ascii="Consolas" w:hAnsi="Consolas"/>
+          <w:sz w:val="20"/>
+        </w:rPr>
+        <w:t>max_results</w:t>
+      </w:r>
+      <w:r>
+        <w:t xml:space="preserve"> </w:t>
+      </w:r>
+      <w:r>
+        <w:rPr>
+          <w:rFonts w:ascii="Consolas" w:hAnsi="Consolas"/>
+          <w:sz w:val="20"/>
+        </w:rPr>
+        <w:t>geo_location</w:t>
+      </w:r>
+      <w:r>
+        <w:t>- entiteiten aan (</w:t>
+      </w:r>
+      <w:r>
+        <w:rPr>
+          <w:rFonts w:ascii="Consolas" w:hAnsi="Consolas"/>
+          <w:sz w:val="20"/>
+        </w:rPr>
+        <w:t>geo_location.&lt;zone&gt;_map_marker_0</w:t>
+      </w:r>
+      <w:r>
+        <w:t xml:space="preserve"> t/m </w:t>
+      </w:r>
+      <w:r>
+        <w:rPr>
+          <w:rFonts w:ascii="Consolas" w:hAnsi="Consolas"/>
+          <w:sz w:val="20"/>
+        </w:rPr>
+        <w:t>_&lt;max_results-1&gt;</w:t>
+      </w:r>
+      <w:r>
+        <w:t xml:space="preserve">) — één per huidige topresultaat, met de exacte coördinaten van de laadlocatie. Voeg ze toe aan een standaard Home Assistant </w:t>
+      </w:r>
+      <w:r>
+        <w:rPr>
+          <w:rFonts w:ascii="Consolas" w:hAnsi="Consolas"/>
+          <w:sz w:val="20"/>
+        </w:rPr>
+        <w:t>map</w:t>
+      </w:r>
+      <w:r>
+        <w:t>-kaart om ze als gekleurde punten te zien:</w:t>
       </w:r>
     </w:p>
     <w:tbl>
@@ -1079,17 +2169,370 @@
         <w:tc>
           <w:tcPr>
             <w:tcW w:type="dxa" w:w="8640"/>
+            <w:shd w:val="clear" w:color="auto" w:fill="F0F9FF"/>
+          </w:tcPr>
+          <w:p>
+            <w:r>
+              <w:rPr>
+                <w:rFonts w:ascii="Consolas" w:hAnsi="Consolas"/>
+                <w:sz w:val="19"/>
+              </w:rPr>
+              <w:t>- type: map</w:t>
+            </w:r>
+            <w:r>
+              <w:br/>
+            </w:r>
+            <w:r>
+              <w:rPr>
+                <w:rFonts w:ascii="Consolas" w:hAnsi="Consolas"/>
+                <w:sz w:val="19"/>
+              </w:rPr>
+              <w:t xml:space="preserve">  entities:</w:t>
+            </w:r>
+            <w:r>
+              <w:br/>
+            </w:r>
+            <w:r>
+              <w:rPr>
+                <w:rFonts w:ascii="Consolas" w:hAnsi="Consolas"/>
+                <w:sz w:val="19"/>
+              </w:rPr>
+              <w:t xml:space="preserve">    - entity: geo_location.laadpaal_map_marker_0</w:t>
+            </w:r>
+            <w:r>
+              <w:br/>
+            </w:r>
+            <w:r>
+              <w:rPr>
+                <w:rFonts w:ascii="Consolas" w:hAnsi="Consolas"/>
+                <w:sz w:val="19"/>
+              </w:rPr>
+              <w:t xml:space="preserve">    - entity: geo_location.laadpaal_map_marker_1</w:t>
+            </w:r>
+            <w:r>
+              <w:br/>
+            </w:r>
+            <w:r>
+              <w:rPr>
+                <w:rFonts w:ascii="Consolas" w:hAnsi="Consolas"/>
+                <w:sz w:val="19"/>
+              </w:rPr>
+              <w:t xml:space="preserve">    - entity: geo_location.laadpaal_map_marker_2</w:t>
+            </w:r>
+            <w:r>
+              <w:br/>
+            </w:r>
+            <w:r>
+              <w:rPr>
+                <w:rFonts w:ascii="Consolas" w:hAnsi="Consolas"/>
+                <w:sz w:val="19"/>
+              </w:rPr>
+              <w:t xml:space="preserve">    - entity: geo_location.laadpaal_map_marker_3</w:t>
+            </w:r>
+            <w:r>
+              <w:br/>
+            </w:r>
+            <w:r>
+              <w:rPr>
+                <w:rFonts w:ascii="Consolas" w:hAnsi="Consolas"/>
+                <w:sz w:val="19"/>
+              </w:rPr>
+              <w:t xml:space="preserve">    - entity: geo_location.laadpaal_map_marker_4</w:t>
+            </w:r>
+          </w:p>
+        </w:tc>
+      </w:tr>
+    </w:tbl>
+    <w:p/>
+    <w:p>
+      <w:r>
+        <w:rPr>
+          <w:b/>
+        </w:rPr>
+        <w:t>Upgrade je van vóór v1.4.1?</w:t>
+      </w:r>
+      <w:r>
+        <w:t xml:space="preserve"> Marker-entiteiten die al bestonden vóór deze versie hebben mogelijk een andere, onvoorspelbare entity-ID gekregen (een bekende bug, zie </w:t>
+      </w:r>
+      <w:r>
+        <w:rPr>
+          <w:rFonts w:ascii="Consolas" w:hAnsi="Consolas"/>
+          <w:sz w:val="20"/>
+        </w:rPr>
+        <w:t>CHANGELOG.md</w:t>
+      </w:r>
+      <w:r>
+        <w:t xml:space="preserve">). Verwijder in dat geval de bestaande </w:t>
+      </w:r>
+      <w:r>
+        <w:rPr>
+          <w:rFonts w:ascii="Consolas" w:hAnsi="Consolas"/>
+          <w:sz w:val="20"/>
+        </w:rPr>
+        <w:t>geo_location</w:t>
+      </w:r>
+      <w:r>
+        <w:t xml:space="preserve">-markerentiteiten via </w:t>
+      </w:r>
+      <w:r>
+        <w:rPr>
+          <w:b/>
+        </w:rPr>
+        <w:t>Instellingen → Apparaten &amp; diensten → Entiteiten</w:t>
+      </w:r>
+      <w:r>
+        <w:t xml:space="preserve"> en herstart Home Assistant — ze worden dan opnieuw aangemaakt met de juiste, vaste </w:t>
+      </w:r>
+      <w:r>
+        <w:rPr>
+          <w:rFonts w:ascii="Consolas" w:hAnsi="Consolas"/>
+          <w:sz w:val="20"/>
+        </w:rPr>
+        <w:t>map_marker_&lt;index&gt;</w:t>
+      </w:r>
+      <w:r>
+        <w:t>-entity-ID's.</w:t>
+      </w:r>
+    </w:p>
+    <w:p>
+      <w:r>
+        <w:t>De marker-kleur volgt automatisch de beschikbaarheid van die locatie:</w:t>
+      </w:r>
+    </w:p>
+    <w:tbl>
+      <w:tblPr>
+        <w:tblStyle w:val="TableGrid"/>
+        <w:tblW w:type="auto" w:w="0"/>
+        <w:tblLook w:firstColumn="1" w:firstRow="1" w:lastColumn="0" w:lastRow="0" w:noHBand="0" w:noVBand="1" w:val="04A0"/>
+      </w:tblPr>
+      <w:tblGrid>
+        <w:gridCol w:w="4320"/>
+        <w:gridCol w:w="4320"/>
+      </w:tblGrid>
+      <w:tr>
+        <w:tc>
+          <w:tcPr>
+            <w:tcW w:type="dxa" w:w="4320"/>
             <w:shd w:val="clear" w:color="auto" w:fill="013449"/>
           </w:tcPr>
           <w:p>
-            <w:r/>
             <w:r>
               <w:rPr>
                 <w:b/>
                 <w:color w:val="FFFFFF"/>
-                <w:sz w:val="36"/>
               </w:rPr>
-              <w:t>8. Veelvoorkomende fouten</w:t>
+              <w:t>Kleur</w:t>
+            </w:r>
+          </w:p>
+        </w:tc>
+        <w:tc>
+          <w:tcPr>
+            <w:tcW w:type="dxa" w:w="4320"/>
+            <w:shd w:val="clear" w:color="auto" w:fill="013449"/>
+          </w:tcPr>
+          <w:p>
+            <w:r>
+              <w:rPr>
+                <w:b/>
+                <w:color w:val="FFFFFF"/>
+              </w:rPr>
+              <w:t>Betekenis</w:t>
+            </w:r>
+          </w:p>
+        </w:tc>
+      </w:tr>
+      <w:tr>
+        <w:tc>
+          <w:tcPr>
+            <w:tcW w:type="dxa" w:w="4320"/>
+          </w:tcPr>
+          <w:p>
+            <w:r>
+              <w:rPr>
+                <w:sz w:val="20"/>
+              </w:rPr>
+              <w:t>🔴 Rood</w:t>
+            </w:r>
+          </w:p>
+        </w:tc>
+        <w:tc>
+          <w:tcPr>
+            <w:tcW w:type="dxa" w:w="4320"/>
+          </w:tcPr>
+          <w:p>
+            <w:r>
+              <w:rPr>
+                <w:sz w:val="20"/>
+              </w:rPr>
+              <w:t>0 aansluitingen beschikbaar</w:t>
+            </w:r>
+          </w:p>
+        </w:tc>
+      </w:tr>
+      <w:tr>
+        <w:tc>
+          <w:tcPr>
+            <w:tcW w:type="dxa" w:w="4320"/>
+          </w:tcPr>
+          <w:p>
+            <w:r>
+              <w:rPr>
+                <w:sz w:val="20"/>
+              </w:rPr>
+              <w:t>🟠 Oranje</w:t>
+            </w:r>
+          </w:p>
+        </w:tc>
+        <w:tc>
+          <w:tcPr>
+            <w:tcW w:type="dxa" w:w="4320"/>
+          </w:tcPr>
+          <w:p>
+            <w:r>
+              <w:rPr>
+                <w:sz w:val="20"/>
+              </w:rPr>
+              <w:t>1 aansluiting beschikbaar</w:t>
+            </w:r>
+          </w:p>
+        </w:tc>
+      </w:tr>
+      <w:tr>
+        <w:tc>
+          <w:tcPr>
+            <w:tcW w:type="dxa" w:w="4320"/>
+          </w:tcPr>
+          <w:p>
+            <w:r>
+              <w:rPr>
+                <w:sz w:val="20"/>
+              </w:rPr>
+              <w:t>🟢 Groen</w:t>
+            </w:r>
+          </w:p>
+        </w:tc>
+        <w:tc>
+          <w:tcPr>
+            <w:tcW w:type="dxa" w:w="4320"/>
+          </w:tcPr>
+          <w:p>
+            <w:r>
+              <w:rPr>
+                <w:sz w:val="20"/>
+              </w:rPr>
+              <w:t>2 of meer aansluitingen beschikbaar</w:t>
+            </w:r>
+          </w:p>
+        </w:tc>
+      </w:tr>
+    </w:tbl>
+    <w:p/>
+    <w:p>
+      <w:r>
+        <w:t xml:space="preserve">Een marker-"slot" toont altijd de huidige #N-locatie uit de resultatenlijst — welke fysieke laadpaal dat is kan dus tussen updates wisselen (net als bij de "Beste laadlocatie"-sensor). Is er geen locatie meer op die positie (bv. omdat er minder dan </w:t>
+      </w:r>
+      <w:r>
+        <w:rPr>
+          <w:rFonts w:ascii="Consolas" w:hAnsi="Consolas"/>
+          <w:sz w:val="20"/>
+        </w:rPr>
+        <w:t>max_results</w:t>
+      </w:r>
+      <w:r>
+        <w:t xml:space="preserve"> locaties gevonden zijn), dan wordt die marker automatisch "unavailable" en niet op de kaart getoond.</w:t>
+      </w:r>
+    </w:p>
+    <w:tbl>
+      <w:tblPr>
+        <w:tblW w:type="auto" w:w="0"/>
+        <w:tblLayout w:type="autofit"/>
+        <w:tblLook w:firstColumn="1" w:firstRow="1" w:lastColumn="0" w:lastRow="0" w:noHBand="0" w:noVBand="1" w:val="04A0"/>
+      </w:tblPr>
+      <w:tblGrid>
+        <w:gridCol w:w="8640"/>
+      </w:tblGrid>
+      <w:tr>
+        <w:tc>
+          <w:tcPr>
+            <w:tcW w:type="dxa" w:w="8640"/>
+            <w:shd w:val="clear" w:color="auto" w:fill="013449"/>
+          </w:tcPr>
+          <w:p>
+            <w:r>
+              <w:rPr>
+                <w:b/>
+                <w:color w:val="FFFFFF"/>
+                <w:sz w:val="30"/>
+              </w:rPr>
+              <w:t>14. Simulatiemodus</w:t>
+            </w:r>
+          </w:p>
+        </w:tc>
+      </w:tr>
+    </w:tbl>
+    <w:p/>
+    <w:p>
+      <w:r>
+        <w:t>Schakel simulatiemodus in tijdens het toevoegen of via de opties om de integratie te testen zonder echte API-calls. Simulatiemodus levert drie vaste testlocaties met verschillende beschikbaarheid (deels beschikbaar, volledig bezet, hoog vermogen beschikbaar) rond je zone, duidelijk herkenbaar aan de naam ("Sim ...") en de databron "Simulatie".</w:t>
+      </w:r>
+    </w:p>
+    <w:p>
+      <w:r>
+        <w:t>Handig om:</w:t>
+      </w:r>
+    </w:p>
+    <w:p>
+      <w:pPr>
+        <w:pStyle w:val="ListBullet"/>
+      </w:pPr>
+      <w:r>
+        <w:t>de notificatietekst te controleren (testknop);</w:t>
+      </w:r>
+    </w:p>
+    <w:p>
+      <w:pPr>
+        <w:pStyle w:val="ListBullet"/>
+      </w:pPr>
+      <w:r>
+        <w:t>stale-databehandeling te testen (zet de maximumleeftijd laag en wacht);</w:t>
+      </w:r>
+    </w:p>
+    <w:p>
+      <w:pPr>
+        <w:pStyle w:val="ListBullet"/>
+      </w:pPr>
+      <w:r>
+        <w:t>zone-entrygedrag te testen (verplaats de gevolgde persoon/tracker via</w:t>
+      </w:r>
+    </w:p>
+    <w:p>
+      <w:r>
+        <w:t>Ontwikkelaarstools naar de zone).</w:t>
+      </w:r>
+    </w:p>
+    <w:tbl>
+      <w:tblPr>
+        <w:tblW w:type="auto" w:w="0"/>
+        <w:tblLayout w:type="autofit"/>
+        <w:tblLook w:firstColumn="1" w:firstRow="1" w:lastColumn="0" w:lastRow="0" w:noHBand="0" w:noVBand="1" w:val="04A0"/>
+      </w:tblPr>
+      <w:tblGrid>
+        <w:gridCol w:w="8640"/>
+      </w:tblGrid>
+      <w:tr>
+        <w:tc>
+          <w:tcPr>
+            <w:tcW w:type="dxa" w:w="8640"/>
+            <w:shd w:val="clear" w:color="auto" w:fill="013449"/>
+          </w:tcPr>
+          <w:p>
+            <w:r>
+              <w:rPr>
+                <w:b/>
+                <w:color w:val="FFFFFF"/>
+                <w:sz w:val="30"/>
+              </w:rPr>
+              <w:t>15. Veelvoorkomende fouten</w:t>
             </w:r>
           </w:p>
         </w:tc>
@@ -1114,12 +2557,10 @@
             <w:shd w:val="clear" w:color="auto" w:fill="013449"/>
           </w:tcPr>
           <w:p>
-            <w:r/>
             <w:r>
               <w:rPr>
                 <w:b/>
                 <w:color w:val="FFFFFF"/>
-                <w:sz w:val="21"/>
               </w:rPr>
               <w:t>Foutcode</w:t>
             </w:r>
@@ -1131,12 +2572,10 @@
             <w:shd w:val="clear" w:color="auto" w:fill="013449"/>
           </w:tcPr>
           <w:p>
-            <w:r/>
             <w:r>
               <w:rPr>
                 <w:b/>
                 <w:color w:val="FFFFFF"/>
-                <w:sz w:val="21"/>
               </w:rPr>
               <w:t>Betekenis</w:t>
             </w:r>
@@ -1148,12 +2587,10 @@
             <w:shd w:val="clear" w:color="auto" w:fill="013449"/>
           </w:tcPr>
           <w:p>
-            <w:r/>
             <w:r>
               <w:rPr>
                 <w:b/>
                 <w:color w:val="FFFFFF"/>
-                <w:sz w:val="21"/>
               </w:rPr>
               <w:t>Oplossing</w:t>
             </w:r>
@@ -1164,13 +2601,11 @@
         <w:tc>
           <w:tcPr>
             <w:tcW w:type="dxa" w:w="2880"/>
-            <w:shd w:val="clear" w:color="auto" w:fill="F0F9FF"/>
           </w:tcPr>
           <w:p>
-            <w:r/>
             <w:r>
               <w:rPr>
-                <w:color w:val="1A1A1A"/>
+                <w:rFonts w:ascii="Consolas" w:hAnsi="Consolas"/>
                 <w:sz w:val="20"/>
               </w:rPr>
               <w:t>invalid_zone</w:t>
@@ -1180,32 +2615,26 @@
         <w:tc>
           <w:tcPr>
             <w:tcW w:type="dxa" w:w="2880"/>
-            <w:shd w:val="clear" w:color="auto" w:fill="F0F9FF"/>
           </w:tcPr>
           <w:p>
-            <w:r/>
             <w:r>
               <w:rPr>
-                <w:color w:val="1A1A1A"/>
                 <w:sz w:val="20"/>
               </w:rPr>
-              <w:t>Zone niet gevonden</w:t>
+              <w:t>Zone niet gevonden of ongeldige coördinaten</w:t>
             </w:r>
           </w:p>
         </w:tc>
         <w:tc>
           <w:tcPr>
             <w:tcW w:type="dxa" w:w="2880"/>
-            <w:shd w:val="clear" w:color="auto" w:fill="F0F9FF"/>
           </w:tcPr>
           <w:p>
-            <w:r/>
             <w:r>
               <w:rPr>
-                <w:color w:val="1A1A1A"/>
                 <w:sz w:val="20"/>
               </w:rPr>
-              <w:t>Kies een bestaande zone</w:t>
+              <w:t>Kies een bestaande zone met geldige latitude/longitude</w:t>
             </w:r>
           </w:p>
         </w:tc>
@@ -1214,13 +2643,11 @@
         <w:tc>
           <w:tcPr>
             <w:tcW w:type="dxa" w:w="2880"/>
-            <w:shd w:val="clear" w:color="auto" w:fill="F0F9FF"/>
           </w:tcPr>
           <w:p>
-            <w:r/>
             <w:r>
               <w:rPr>
-                <w:color w:val="1A1A1A"/>
+                <w:rFonts w:ascii="Consolas" w:hAnsi="Consolas"/>
                 <w:sz w:val="20"/>
               </w:rPr>
               <w:t>invalid_entity</w:t>
@@ -1230,32 +2657,26 @@
         <w:tc>
           <w:tcPr>
             <w:tcW w:type="dxa" w:w="2880"/>
-            <w:shd w:val="clear" w:color="auto" w:fill="F0F9FF"/>
           </w:tcPr>
           <w:p>
-            <w:r/>
             <w:r>
               <w:rPr>
-                <w:color w:val="1A1A1A"/>
                 <w:sz w:val="20"/>
               </w:rPr>
-              <w:t>Geen geldige persoon/tracker</w:t>
+              <w:t>Geen geldige persoon/tracker geselecteerd</w:t>
             </w:r>
           </w:p>
         </w:tc>
         <w:tc>
           <w:tcPr>
             <w:tcW w:type="dxa" w:w="2880"/>
-            <w:shd w:val="clear" w:color="auto" w:fill="F0F9FF"/>
           </w:tcPr>
           <w:p>
-            <w:r/>
             <w:r>
               <w:rPr>
-                <w:color w:val="1A1A1A"/>
                 <w:sz w:val="20"/>
               </w:rPr>
-              <w:t>Selecteer minimaal één entiteit</w:t>
+              <w:t>Selecteer minimaal één bestaande entiteit</w:t>
             </w:r>
           </w:p>
         </w:tc>
@@ -1264,13 +2685,11 @@
         <w:tc>
           <w:tcPr>
             <w:tcW w:type="dxa" w:w="2880"/>
-            <w:shd w:val="clear" w:color="auto" w:fill="F0F9FF"/>
           </w:tcPr>
           <w:p>
-            <w:r/>
             <w:r>
               <w:rPr>
-                <w:color w:val="1A1A1A"/>
+                <w:rFonts w:ascii="Consolas" w:hAnsi="Consolas"/>
                 <w:sz w:val="20"/>
               </w:rPr>
               <w:t>cannot_connect</w:t>
@@ -1280,13 +2699,10 @@
         <w:tc>
           <w:tcPr>
             <w:tcW w:type="dxa" w:w="2880"/>
-            <w:shd w:val="clear" w:color="auto" w:fill="F0F9FF"/>
           </w:tcPr>
           <w:p>
-            <w:r/>
             <w:r>
               <w:rPr>
-                <w:color w:val="1A1A1A"/>
                 <w:sz w:val="20"/>
               </w:rPr>
               <w:t>Provider niet bereikbaar</w:t>
@@ -1296,16 +2712,13 @@
         <w:tc>
           <w:tcPr>
             <w:tcW w:type="dxa" w:w="2880"/>
-            <w:shd w:val="clear" w:color="auto" w:fill="F0F9FF"/>
           </w:tcPr>
           <w:p>
-            <w:r/>
             <w:r>
               <w:rPr>
-                <w:color w:val="1A1A1A"/>
                 <w:sz w:val="20"/>
               </w:rPr>
-              <w:t>Controleer internetverbinding</w:t>
+              <w:t>Controleer je internetverbinding</w:t>
             </w:r>
           </w:p>
         </w:tc>
@@ -1314,13 +2727,11 @@
         <w:tc>
           <w:tcPr>
             <w:tcW w:type="dxa" w:w="2880"/>
-            <w:shd w:val="clear" w:color="auto" w:fill="F0F9FF"/>
           </w:tcPr>
           <w:p>
-            <w:r/>
             <w:r>
               <w:rPr>
-                <w:color w:val="1A1A1A"/>
+                <w:rFonts w:ascii="Consolas" w:hAnsi="Consolas"/>
                 <w:sz w:val="20"/>
               </w:rPr>
               <w:t>invalid_auth</w:t>
@@ -1330,32 +2741,26 @@
         <w:tc>
           <w:tcPr>
             <w:tcW w:type="dxa" w:w="2880"/>
-            <w:shd w:val="clear" w:color="auto" w:fill="F0F9FF"/>
           </w:tcPr>
           <w:p>
-            <w:r/>
             <w:r>
               <w:rPr>
-                <w:color w:val="1A1A1A"/>
                 <w:sz w:val="20"/>
               </w:rPr>
-              <w:t>API-key geweigerd/ontbreekt</w:t>
+              <w:t>API-key geweigerd of ontbreekt</w:t>
             </w:r>
           </w:p>
         </w:tc>
         <w:tc>
           <w:tcPr>
             <w:tcW w:type="dxa" w:w="2880"/>
-            <w:shd w:val="clear" w:color="auto" w:fill="F0F9FF"/>
           </w:tcPr>
           <w:p>
-            <w:r/>
             <w:r>
               <w:rPr>
-                <w:color w:val="1A1A1A"/>
                 <w:sz w:val="20"/>
               </w:rPr>
-              <w:t>Controleer de API-key</w:t>
+              <w:t>Controleer de API-key (verplicht voor TomTom/Open Charge Map)</w:t>
             </w:r>
           </w:p>
         </w:tc>
@@ -1364,13 +2769,11 @@
         <w:tc>
           <w:tcPr>
             <w:tcW w:type="dxa" w:w="2880"/>
-            <w:shd w:val="clear" w:color="auto" w:fill="F0F9FF"/>
           </w:tcPr>
           <w:p>
-            <w:r/>
             <w:r>
               <w:rPr>
-                <w:color w:val="1A1A1A"/>
+                <w:rFonts w:ascii="Consolas" w:hAnsi="Consolas"/>
                 <w:sz w:val="20"/>
               </w:rPr>
               <w:t>rate_limited</w:t>
@@ -1380,32 +2783,68 @@
         <w:tc>
           <w:tcPr>
             <w:tcW w:type="dxa" w:w="2880"/>
-            <w:shd w:val="clear" w:color="auto" w:fill="F0F9FF"/>
           </w:tcPr>
           <w:p>
-            <w:r/>
             <w:r>
               <w:rPr>
-                <w:color w:val="1A1A1A"/>
                 <w:sz w:val="20"/>
               </w:rPr>
-              <w:t>Te veel aanvragen</w:t>
+              <w:t>Provider limiteert het aantal aanvragen</w:t>
             </w:r>
           </w:p>
         </w:tc>
         <w:tc>
           <w:tcPr>
             <w:tcW w:type="dxa" w:w="2880"/>
-            <w:shd w:val="clear" w:color="auto" w:fill="F0F9FF"/>
           </w:tcPr>
           <w:p>
-            <w:r/>
             <w:r>
               <w:rPr>
-                <w:color w:val="1A1A1A"/>
                 <w:sz w:val="20"/>
               </w:rPr>
-              <w:t>Probeer later opnieuw</w:t>
+              <w:t>Probeer het later opnieuw, verlaag de update-frequentie</w:t>
+            </w:r>
+          </w:p>
+        </w:tc>
+      </w:tr>
+      <w:tr>
+        <w:tc>
+          <w:tcPr>
+            <w:tcW w:type="dxa" w:w="2880"/>
+          </w:tcPr>
+          <w:p>
+            <w:r>
+              <w:rPr>
+                <w:rFonts w:ascii="Consolas" w:hAnsi="Consolas"/>
+                <w:sz w:val="20"/>
+              </w:rPr>
+              <w:t>invalid_notification_service</w:t>
+            </w:r>
+          </w:p>
+        </w:tc>
+        <w:tc>
+          <w:tcPr>
+            <w:tcW w:type="dxa" w:w="2880"/>
+          </w:tcPr>
+          <w:p>
+            <w:r>
+              <w:rPr>
+                <w:sz w:val="20"/>
+              </w:rPr>
+              <w:t>Notificatiedoel niet gevonden</w:t>
+            </w:r>
+          </w:p>
+        </w:tc>
+        <w:tc>
+          <w:tcPr>
+            <w:tcW w:type="dxa" w:w="2880"/>
+          </w:tcPr>
+          <w:p>
+            <w:r>
+              <w:rPr>
+                <w:sz w:val="20"/>
+              </w:rPr>
+              <w:t>Kies een geldig notificatiedoel</w:t>
             </w:r>
           </w:p>
         </w:tc>
@@ -1415,6 +2854,7 @@
     <w:tbl>
       <w:tblPr>
         <w:tblW w:type="auto" w:w="0"/>
+        <w:tblLayout w:type="autofit"/>
         <w:tblLook w:firstColumn="1" w:firstRow="1" w:lastColumn="0" w:lastRow="0" w:noHBand="0" w:noVBand="1" w:val="04A0"/>
       </w:tblPr>
       <w:tblGrid>
@@ -1427,14 +2867,13 @@
             <w:shd w:val="clear" w:color="auto" w:fill="013449"/>
           </w:tcPr>
           <w:p>
-            <w:r/>
             <w:r>
               <w:rPr>
                 <w:b/>
                 <w:color w:val="FFFFFF"/>
-                <w:sz w:val="36"/>
+                <w:sz w:val="30"/>
               </w:rPr>
-              <w:t>9. Beperkingen</w:t>
+              <w:t>16. Beperkingen</w:t>
             </w:r>
           </w:p>
         </w:tc>
@@ -1446,10 +2885,6 @@
         <w:pStyle w:val="ListBullet"/>
       </w:pPr>
       <w:r>
-        <w:rPr>
-          <w:color w:val="1A1A1A"/>
-          <w:sz w:val="22"/>
-        </w:rPr>
         <w:t>Geen starten/stoppen van laadsessies, reserveren of betalen.</w:t>
       </w:r>
     </w:p>
@@ -1458,10 +2893,6 @@
         <w:pStyle w:val="ListBullet"/>
       </w:pPr>
       <w:r>
-        <w:rPr>
-          <w:color w:val="1A1A1A"/>
-          <w:sz w:val="22"/>
-        </w:rPr>
         <w:t>Geen volledige routeplanning (wel een externe navigatielink).</w:t>
       </w:r>
     </w:p>
@@ -1470,11 +2901,7 @@
         <w:pStyle w:val="ListBullet"/>
       </w:pPr>
       <w:r>
-        <w:rPr>
-          <w:color w:val="1A1A1A"/>
-          <w:sz w:val="22"/>
-        </w:rPr>
-        <w:t>Open Charge Map levert nooit actuele bezetting.</w:t>
+        <w:t>Open Charge Map levert nooit actuele bezetting, alleen locatiegegevens.</w:t>
       </w:r>
     </w:p>
     <w:p>
@@ -1482,16 +2909,28 @@
         <w:pStyle w:val="ListBullet"/>
       </w:pPr>
       <w:r>
+        <w:t>NDW's per-aansluiting-status is een best-effort benadering op basis van</w:t>
+      </w:r>
+    </w:p>
+    <w:p>
+      <w:r>
+        <w:t xml:space="preserve">geaggregeerde tellingen (zie </w:t>
+      </w:r>
+      <w:r>
         <w:rPr>
-          <w:color w:val="1A1A1A"/>
-          <w:sz w:val="22"/>
+          <w:rFonts w:ascii="Consolas" w:hAnsi="Consolas"/>
+          <w:sz w:val="20"/>
         </w:rPr>
-        <w:t>NDW's per-aansluiting-status is een best-effort benadering.</w:t>
+        <w:t>providers/ndw.py</w:t>
+      </w:r>
+      <w:r>
+        <w:t>).</w:t>
       </w:r>
     </w:p>
     <w:tbl>
       <w:tblPr>
         <w:tblW w:type="auto" w:w="0"/>
+        <w:tblLayout w:type="autofit"/>
         <w:tblLook w:firstColumn="1" w:firstRow="1" w:lastColumn="0" w:lastRow="0" w:noHBand="0" w:noVBand="1" w:val="04A0"/>
       </w:tblPr>
       <w:tblGrid>
@@ -1504,14 +2943,13 @@
             <w:shd w:val="clear" w:color="auto" w:fill="013449"/>
           </w:tcPr>
           <w:p>
-            <w:r/>
             <w:r>
               <w:rPr>
                 <w:b/>
                 <w:color w:val="FFFFFF"/>
-                <w:sz w:val="36"/>
+                <w:sz w:val="30"/>
               </w:rPr>
-              <w:t>10. Privacy</w:t>
+              <w:t>17. Privacy</w:t>
             </w:r>
           </w:p>
         </w:tc>
@@ -1519,20 +2957,34 @@
     </w:tbl>
     <w:p/>
     <w:p>
-      <w:pPr>
-        <w:spacing w:after="160"/>
-      </w:pPr>
+      <w:r>
+        <w:t xml:space="preserve">De integratie verwerkt de status van de door jou geselecteerde </w:t>
+      </w:r>
       <w:r>
         <w:rPr>
-          <w:color w:val="1A1A1A"/>
-          <w:sz w:val="22"/>
+          <w:rFonts w:ascii="Consolas" w:hAnsi="Consolas"/>
+          <w:sz w:val="20"/>
         </w:rPr>
-        <w:t>De integratie verwerkt de status van geselecteerde person- en device_tracker-entiteiten, uitsluitend om zone-entry te detecteren. Er wordt geen bewegingshistorie opgeslagen. Diagnostics redacteren de zone, gevolgde entiteiten, API-key en het notificatiedoel volledig.</w:t>
+        <w:t>person</w:t>
+      </w:r>
+      <w:r>
+        <w:t xml:space="preserve">- en </w:t>
+      </w:r>
+      <w:r>
+        <w:rPr>
+          <w:rFonts w:ascii="Consolas" w:hAnsi="Consolas"/>
+          <w:sz w:val="20"/>
+        </w:rPr>
+        <w:t>device_tracker</w:t>
+      </w:r>
+      <w:r>
+        <w:t>-entiteiten, uitsluitend om zone-entry te detecteren. Er wordt geen bewegingshistorie opgeslagen — alleen het moment van de laatst gedetecteerde zone-entry (in het geheugen, niet op schijf). Diagnostics redacteren de gekozen zone, gevolgde entiteiten, API-key en notificatiedoel volledig.</w:t>
       </w:r>
     </w:p>
     <w:tbl>
       <w:tblPr>
         <w:tblW w:type="auto" w:w="0"/>
+        <w:tblLayout w:type="autofit"/>
         <w:tblLook w:firstColumn="1" w:firstRow="1" w:lastColumn="0" w:lastRow="0" w:noHBand="0" w:noVBand="1" w:val="04A0"/>
       </w:tblPr>
       <w:tblGrid>
@@ -1545,14 +2997,13 @@
             <w:shd w:val="clear" w:color="auto" w:fill="013449"/>
           </w:tcPr>
           <w:p>
-            <w:r/>
             <w:r>
               <w:rPr>
                 <w:b/>
                 <w:color w:val="FFFFFF"/>
-                <w:sz w:val="36"/>
+                <w:sz w:val="30"/>
               </w:rPr>
-              <w:t>11. Troubleshooting</w:t>
+              <w:t>18. Troubleshooting</w:t>
             </w:r>
           </w:p>
         </w:tc>
@@ -1561,55 +3012,127 @@
     <w:p/>
     <w:p>
       <w:pPr>
-        <w:pStyle w:val="ListBullet"/>
+        <w:pStyle w:val="ListNumber"/>
       </w:pPr>
       <w:r>
         <w:rPr>
-          <w:color w:val="1A1A1A"/>
-          <w:sz w:val="22"/>
+          <w:b/>
         </w:rPr>
-        <w:t>Geen data? Controleer de sensor API-status en binary sensor API beschikbaar.</w:t>
+        <w:t>Geen data?</w:t>
+      </w:r>
+      <w:r>
+        <w:t xml:space="preserve"> Controleer de sensor "API-status" en binary sensor "API</w:t>
+      </w:r>
+    </w:p>
+    <w:p>
+      <w:r>
+        <w:t xml:space="preserve">beschikbaar". Bekijk de Home Assistant-log op </w:t>
+      </w:r>
+      <w:r>
+        <w:rPr>
+          <w:rFonts w:ascii="Consolas" w:hAnsi="Consolas"/>
+          <w:sz w:val="20"/>
+        </w:rPr>
+        <w:t>warning</w:t>
+      </w:r>
+      <w:r>
+        <w:t>/</w:t>
+      </w:r>
+      <w:r>
+        <w:rPr>
+          <w:rFonts w:ascii="Consolas" w:hAnsi="Consolas"/>
+          <w:sz w:val="20"/>
+        </w:rPr>
+        <w:t>error</w:t>
+      </w:r>
+      <w:r>
+        <w:t>-niveau.</w:t>
       </w:r>
     </w:p>
     <w:p>
       <w:pPr>
-        <w:pStyle w:val="ListBullet"/>
+        <w:pStyle w:val="ListNumber"/>
       </w:pPr>
       <w:r>
         <w:rPr>
-          <w:color w:val="1A1A1A"/>
-          <w:sz w:val="22"/>
+          <w:b/>
         </w:rPr>
-        <w:t>Verouderde data? Controleer binary sensor Data verouderd.</w:t>
+        <w:t>Verouderde data?</w:t>
+      </w:r>
+      <w:r>
+        <w:t xml:space="preserve"> Controleer binary sensor "Data verouderd" en verhoog</w:t>
+      </w:r>
+    </w:p>
+    <w:p>
+      <w:r>
+        <w:t>zo nodig de maximumleeftijd of verlaag het update-interval.</w:t>
       </w:r>
     </w:p>
     <w:p>
       <w:pPr>
-        <w:pStyle w:val="ListBullet"/>
+        <w:pStyle w:val="ListNumber"/>
       </w:pPr>
       <w:r>
         <w:rPr>
-          <w:color w:val="1A1A1A"/>
-          <w:sz w:val="22"/>
+          <w:b/>
         </w:rPr>
-        <w:t>Geen melding? Controleer de zone-entry-toggle, cooldown en het notificatiedoel.</w:t>
+        <w:t>Geen melding ontvangen?</w:t>
+      </w:r>
+      <w:r>
+        <w:t xml:space="preserve"> Controleer of "Melding bij binnenkomst zone"</w:t>
+      </w:r>
+    </w:p>
+    <w:p>
+      <w:r>
+        <w:t>aan staat, of de cooldown nog actief is, en of het notificatiedoel nog bestaat (zie eventuele repair-melding "Notificatiedoel ontbreekt").</w:t>
       </w:r>
     </w:p>
     <w:p>
       <w:pPr>
-        <w:pStyle w:val="ListBullet"/>
+        <w:pStyle w:val="ListNumber"/>
       </w:pPr>
       <w:r>
         <w:rPr>
-          <w:color w:val="1A1A1A"/>
-          <w:sz w:val="22"/>
+          <w:b/>
         </w:rPr>
-        <w:t>Debug-logging: logger: logs: custom_components.vun_ev_charge_monitor: debug</w:t>
+        <w:t>Debug-logging inschakelen</w:t>
+      </w:r>
+      <w:r>
+        <w:t xml:space="preserve">: voeg toe aan </w:t>
+      </w:r>
+      <w:r>
+        <w:rPr>
+          <w:rFonts w:ascii="Consolas" w:hAnsi="Consolas"/>
+          <w:sz w:val="20"/>
+        </w:rPr>
+        <w:t>configuration.yaml</w:t>
+      </w:r>
+      <w:r>
+        <w:t>:</w:t>
+      </w:r>
+    </w:p>
+    <w:p>
+      <w:r>
+        <w:rPr>
+          <w:rFonts w:ascii="Consolas" w:hAnsi="Consolas"/>
+          <w:sz w:val="20"/>
+        </w:rPr>
+        <w:t>`</w:t>
+      </w:r>
+      <w:r>
+        <w:t xml:space="preserve">yaml logger: logs: custom_components.vun_ev_charge_monitor: debug </w:t>
+      </w:r>
+      <w:r>
+        <w:rPr>
+          <w:rFonts w:ascii="Consolas" w:hAnsi="Consolas"/>
+          <w:sz w:val="20"/>
+        </w:rPr>
+        <w:t>`</w:t>
       </w:r>
     </w:p>
     <w:sectPr>
       <w:pgSz w:w="12240" w:h="15840"/>
-      <w:pgMar w:top="1701" w:right="1800" w:bottom="1440" w:left="1800" w:header="720" w:footer="720" w:gutter="0"/>
+      <w:pgMar w:top="1699" w:right="1800" w:bottom="1440" w:left="1800" w:header="720" w:footer="720" w:gutter="0"/>
       <w:cols w:space="720"/>
       <w:docGrid w:linePitch="360"/>
     </w:sectPr>

</xml_diff>